<commit_message>
Writing core math model in thesis doc
</commit_message>
<xml_diff>
--- a/Praca_Inzynierska_Jakub_Bednarczyk.docx
+++ b/Praca_Inzynierska_Jakub_Bednarczyk.docx
@@ -25,6 +25,7 @@
     <w:p>
       <w:pPr>
         <w:pStyle w:val="RealNormal"/>
+        <w:jc w:val="center"/>
       </w:pPr>
       <w:r>
         <w:rPr>
@@ -337,15 +338,6 @@
     </w:p>
     <w:p>
       <w:pPr>
-        <w:spacing w:line="240" w:lineRule="auto"/>
-        <w:rPr>
-          <w:rFonts w:ascii="Titillium" w:eastAsia="Calibri" w:hAnsi="Titillium"/>
-          <w:lang w:val="en-GB"/>
-        </w:rPr>
-      </w:pPr>
-    </w:p>
-    <w:p>
-      <w:pPr>
         <w:tabs>
           <w:tab w:val="left" w:pos="2835"/>
         </w:tabs>
@@ -502,29 +494,21 @@
     <w:p>
       <w:pPr>
         <w:spacing w:line="240" w:lineRule="auto"/>
+        <w:jc w:val="center"/>
         <w:rPr>
           <w:rFonts w:ascii="Titillium" w:eastAsia="Calibri" w:hAnsi="Titillium"/>
         </w:rPr>
       </w:pPr>
-    </w:p>
-    <w:p>
-      <w:pPr>
-        <w:spacing w:line="240" w:lineRule="auto"/>
-        <w:jc w:val="center"/>
+      <w:r>
         <w:rPr>
           <w:rFonts w:ascii="Titillium" w:eastAsia="Calibri" w:hAnsi="Titillium"/>
         </w:rPr>
-      </w:pPr>
+        <w:t xml:space="preserve">Kraków, </w:t>
+      </w:r>
       <w:r>
         <w:rPr>
           <w:rFonts w:ascii="Titillium" w:eastAsia="Calibri" w:hAnsi="Titillium"/>
         </w:rPr>
-        <w:t xml:space="preserve">Kraków, </w:t>
-      </w:r>
-      <w:r>
-        <w:rPr>
-          <w:rFonts w:ascii="Titillium" w:eastAsia="Calibri" w:hAnsi="Titillium"/>
-        </w:rPr>
         <w:t>2027</w:t>
       </w:r>
     </w:p>
@@ -539,6 +523,7 @@
         <w:rPr>
           <w:rFonts w:eastAsia="Calibri"/>
         </w:rPr>
+        <w:lastRenderedPageBreak/>
         <w:t>Wstęp</w:t>
       </w:r>
       <w:r>
@@ -604,7 +589,13 @@
         <w:pStyle w:val="Heading2"/>
       </w:pPr>
       <w:r>
-        <w:t>Model balistyki zewnętrzne</w:t>
+        <w:t xml:space="preserve">Model </w:t>
+      </w:r>
+      <w:r>
+        <w:t>balistyki</w:t>
+      </w:r>
+      <w:r>
+        <w:t xml:space="preserve"> zewnętrzne</w:t>
       </w:r>
       <w:r>
         <w:t>j</w:t>
@@ -924,7 +915,13 @@
         <w:t>ujemne przyśpieszenie</w:t>
       </w:r>
       <w:r>
-        <w:t xml:space="preserve"> pocisku za pomocą</w:t>
+        <w:t xml:space="preserve"> pocisku</w:t>
+      </w:r>
+      <w:r>
+        <w:t xml:space="preserve"> (a)</w:t>
+      </w:r>
+      <w:r>
+        <w:t xml:space="preserve"> za pomocą</w:t>
       </w:r>
       <w:r>
         <w:t xml:space="preserve"> </w:t>
@@ -1034,16 +1031,7 @@
         <w:ind w:left="708"/>
       </w:pPr>
       <w:r>
-        <w:t>a – przyśpieszenie [m/s</w:t>
-      </w:r>
-      <w:r>
-        <w:rPr>
-          <w:vertAlign w:val="superscript"/>
-        </w:rPr>
-        <w:t>2</w:t>
-      </w:r>
-      <w:r>
-        <w:t>]</w:t>
+        <w:t>F – siła [N]</w:t>
       </w:r>
     </w:p>
     <w:p>
@@ -1051,389 +1039,117 @@
         <w:ind w:left="708"/>
       </w:pPr>
       <w:r>
-        <w:t>F – siła [N]</w:t>
-      </w:r>
-    </w:p>
-    <w:p>
-      <w:pPr>
-        <w:ind w:left="708"/>
-      </w:pPr>
-      <w:r>
         <w:t>m – masa [kg]</w:t>
       </w:r>
     </w:p>
     <w:p>
       <w:pPr>
+        <w:pStyle w:val="Heading2"/>
+      </w:pPr>
+      <w:r>
+        <w:t xml:space="preserve"> </w:t>
+      </w:r>
+      <w:r>
+        <w:t>Model balistyki końcowej</w:t>
+      </w:r>
+    </w:p>
+    <w:p>
+      <w:r>
+        <w:t xml:space="preserve">Jeżeli </w:t>
+      </w:r>
+      <w:r>
+        <w:t>dynamiczna granica plastyczności materiału pocisku</w:t>
+      </w:r>
+      <w:r>
+        <w:t xml:space="preserve"> </w:t>
+      </w:r>
+      <w:proofErr w:type="spellStart"/>
+      <w:r>
+        <w:t>Y</w:t>
+      </w:r>
+      <w:r>
+        <w:rPr>
+          <w:vertAlign w:val="subscript"/>
+        </w:rPr>
+        <w:t>p</w:t>
+      </w:r>
+      <w:proofErr w:type="spellEnd"/>
+      <w:r>
+        <w:t xml:space="preserve"> jest większa od oporu celu </w:t>
+      </w:r>
+      <w:proofErr w:type="spellStart"/>
+      <w:r>
+        <w:t>R</w:t>
+      </w:r>
+      <w:r>
+        <w:rPr>
+          <w:vertAlign w:val="subscript"/>
+        </w:rPr>
+        <w:t>t</w:t>
+      </w:r>
+      <w:proofErr w:type="spellEnd"/>
+      <w:r>
+        <w:t xml:space="preserve"> pocisk zachowa się jak ciało sztywne</w:t>
+      </w:r>
+      <w:r>
+        <w:t>, w przeciwnym razie</w:t>
+      </w:r>
+      <w:r>
+        <w:t xml:space="preserve"> pocisk zaczyna się odkształcać</w:t>
+      </w:r>
+      <w:r>
+        <w:t>. W zależności od tego czy pocisk pozostanie sztywny czy też nie należy zastosować inne równania.</w:t>
+      </w:r>
+    </w:p>
+    <w:p>
+      <w:pPr>
         <w:pStyle w:val="Heading3"/>
       </w:pPr>
       <w:r>
-        <w:br w:type="page"/>
-      </w:r>
-    </w:p>
-    <w:p>
-      <w:pPr>
-        <w:pStyle w:val="Heading2"/>
-      </w:pPr>
-      <w:r>
-        <w:lastRenderedPageBreak/>
-        <w:t>Model balistyki końcowej</w:t>
-      </w:r>
-    </w:p>
-    <w:p>
-      <w:r>
-        <w:t>Podczas kontaktu pocisku z celem najpierw liczony jest warunek rykoszetu w postaci:</w:t>
-      </w:r>
-    </w:p>
-    <w:tbl>
-      <w:tblPr>
-        <w:tblStyle w:val="TableGrid"/>
-        <w:tblW w:w="0" w:type="auto"/>
-        <w:tblBorders>
-          <w:top w:val="none" w:sz="0" w:space="0" w:color="auto"/>
-          <w:left w:val="none" w:sz="0" w:space="0" w:color="auto"/>
-          <w:bottom w:val="none" w:sz="0" w:space="0" w:color="auto"/>
-          <w:right w:val="none" w:sz="0" w:space="0" w:color="auto"/>
-          <w:insideH w:val="none" w:sz="0" w:space="0" w:color="auto"/>
-          <w:insideV w:val="none" w:sz="0" w:space="0" w:color="auto"/>
-        </w:tblBorders>
-        <w:tblLook w:val="04A0" w:firstRow="1" w:lastRow="0" w:firstColumn="1" w:lastColumn="0" w:noHBand="0" w:noVBand="1"/>
-      </w:tblPr>
-      <w:tblGrid>
-        <w:gridCol w:w="3209"/>
-        <w:gridCol w:w="3209"/>
-        <w:gridCol w:w="3210"/>
-      </w:tblGrid>
-      <w:tr>
-        <w:tc>
-          <w:tcPr>
-            <w:tcW w:w="3209" w:type="dxa"/>
-          </w:tcPr>
-          <w:p/>
-        </w:tc>
-        <w:tc>
-          <w:tcPr>
-            <w:tcW w:w="3209" w:type="dxa"/>
-          </w:tcPr>
-          <w:p>
-            <m:oMathPara>
-              <m:oMath>
-                <m:func>
-                  <m:funcPr>
-                    <m:ctrlPr>
-                      <w:rPr>
-                        <w:rFonts w:ascii="Cambria Math" w:hAnsi="Cambria Math"/>
-                        <w:i/>
-                      </w:rPr>
-                    </m:ctrlPr>
-                  </m:funcPr>
-                  <m:fName>
-                    <m:sSup>
-                      <m:sSupPr>
-                        <m:ctrlPr>
-                          <w:rPr>
-                            <w:rFonts w:ascii="Cambria Math" w:hAnsi="Cambria Math"/>
-                            <w:i/>
-                          </w:rPr>
-                        </m:ctrlPr>
-                      </m:sSupPr>
-                      <m:e>
-                        <m:r>
-                          <m:rPr>
-                            <m:sty m:val="p"/>
-                          </m:rPr>
-                          <w:rPr>
-                            <w:rFonts w:ascii="Cambria Math" w:hAnsi="Cambria Math"/>
-                          </w:rPr>
-                          <m:t>tan</m:t>
-                        </m:r>
-                        <m:ctrlPr>
-                          <w:rPr>
-                            <w:rFonts w:ascii="Cambria Math" w:hAnsi="Cambria Math"/>
-                          </w:rPr>
-                        </m:ctrlPr>
-                      </m:e>
-                      <m:sup>
-                        <m:r>
-                          <w:rPr>
-                            <w:rFonts w:ascii="Cambria Math" w:hAnsi="Cambria Math"/>
-                          </w:rPr>
-                          <m:t>2</m:t>
-                        </m:r>
-                        <m:ctrlPr>
-                          <w:rPr>
-                            <w:rFonts w:ascii="Cambria Math" w:hAnsi="Cambria Math"/>
-                          </w:rPr>
-                        </m:ctrlPr>
-                      </m:sup>
-                    </m:sSup>
-                  </m:fName>
-                  <m:e>
-                    <m:r>
-                      <w:rPr>
-                        <w:rFonts w:ascii="Cambria Math" w:hAnsi="Cambria Math"/>
-                      </w:rPr>
-                      <m:t>β</m:t>
-                    </m:r>
-                  </m:e>
-                </m:func>
-                <m:r>
-                  <w:rPr>
-                    <w:rFonts w:ascii="Cambria Math" w:hAnsi="Cambria Math"/>
-                  </w:rPr>
-                  <m:t>&gt;</m:t>
-                </m:r>
-                <m:f>
-                  <m:fPr>
-                    <m:ctrlPr>
-                      <w:rPr>
-                        <w:rFonts w:ascii="Cambria Math" w:hAnsi="Cambria Math"/>
-                        <w:i/>
-                      </w:rPr>
-                    </m:ctrlPr>
-                  </m:fPr>
-                  <m:num>
-                    <m:sSub>
-                      <m:sSubPr>
-                        <m:ctrlPr>
-                          <w:rPr>
-                            <w:rFonts w:ascii="Cambria Math" w:hAnsi="Cambria Math"/>
-                            <w:i/>
-                          </w:rPr>
-                        </m:ctrlPr>
-                      </m:sSubPr>
-                      <m:e>
-                        <m:r>
-                          <w:rPr>
-                            <w:rFonts w:ascii="Cambria Math" w:hAnsi="Cambria Math"/>
-                          </w:rPr>
-                          <m:t>ρ</m:t>
-                        </m:r>
-                      </m:e>
-                      <m:sub>
-                        <m:r>
-                          <w:rPr>
-                            <w:rFonts w:ascii="Cambria Math" w:hAnsi="Cambria Math"/>
-                          </w:rPr>
-                          <m:t>p</m:t>
-                        </m:r>
-                      </m:sub>
-                    </m:sSub>
-                    <m:sSup>
-                      <m:sSupPr>
-                        <m:ctrlPr>
-                          <w:rPr>
-                            <w:rFonts w:ascii="Cambria Math" w:hAnsi="Cambria Math"/>
-                            <w:i/>
-                          </w:rPr>
-                        </m:ctrlPr>
-                      </m:sSupPr>
-                      <m:e>
-                        <m:r>
-                          <w:rPr>
-                            <w:rFonts w:ascii="Cambria Math" w:hAnsi="Cambria Math"/>
-                          </w:rPr>
-                          <m:t>V</m:t>
-                        </m:r>
-                      </m:e>
-                      <m:sup>
-                        <m:r>
-                          <w:rPr>
-                            <w:rFonts w:ascii="Cambria Math" w:hAnsi="Cambria Math"/>
-                          </w:rPr>
-                          <m:t>2</m:t>
-                        </m:r>
-                      </m:sup>
-                    </m:sSup>
-                  </m:num>
-                  <m:den>
-                    <m:sSub>
-                      <m:sSubPr>
-                        <m:ctrlPr>
-                          <w:rPr>
-                            <w:rFonts w:ascii="Cambria Math" w:hAnsi="Cambria Math"/>
-                            <w:i/>
-                          </w:rPr>
-                        </m:ctrlPr>
-                      </m:sSubPr>
-                      <m:e>
-                        <m:r>
-                          <w:rPr>
-                            <w:rFonts w:ascii="Cambria Math" w:hAnsi="Cambria Math"/>
-                          </w:rPr>
-                          <m:t>R</m:t>
-                        </m:r>
-                      </m:e>
-                      <m:sub>
-                        <m:r>
-                          <w:rPr>
-                            <w:rFonts w:ascii="Cambria Math" w:hAnsi="Cambria Math"/>
-                          </w:rPr>
-                          <m:t>t</m:t>
-                        </m:r>
-                      </m:sub>
-                    </m:sSub>
-                  </m:den>
-                </m:f>
-                <m:d>
-                  <m:dPr>
-                    <m:ctrlPr>
-                      <w:rPr>
-                        <w:rFonts w:ascii="Cambria Math" w:hAnsi="Cambria Math"/>
-                        <w:i/>
-                      </w:rPr>
-                    </m:ctrlPr>
-                  </m:dPr>
-                  <m:e>
-                    <m:f>
-                      <m:fPr>
-                        <m:ctrlPr>
-                          <w:rPr>
-                            <w:rFonts w:ascii="Cambria Math" w:hAnsi="Cambria Math"/>
-                            <w:i/>
-                          </w:rPr>
-                        </m:ctrlPr>
-                      </m:fPr>
-                      <m:num>
-                        <m:r>
-                          <w:rPr>
-                            <w:rFonts w:ascii="Cambria Math" w:hAnsi="Cambria Math"/>
-                          </w:rPr>
-                          <m:t>V+U</m:t>
-                        </m:r>
-                      </m:num>
-                      <m:den>
-                        <m:r>
-                          <w:rPr>
-                            <w:rFonts w:ascii="Cambria Math" w:hAnsi="Cambria Math"/>
-                          </w:rPr>
-                          <m:t>V-U</m:t>
-                        </m:r>
-                      </m:den>
-                    </m:f>
-                  </m:e>
-                </m:d>
-              </m:oMath>
-            </m:oMathPara>
-          </w:p>
-        </w:tc>
-        <w:tc>
-          <w:tcPr>
-            <w:tcW w:w="3210" w:type="dxa"/>
-            <w:vAlign w:val="center"/>
-          </w:tcPr>
-          <w:p>
-            <w:pPr>
-              <w:tabs>
-                <w:tab w:val="left" w:pos="864"/>
-              </w:tabs>
-              <w:jc w:val="right"/>
-            </w:pPr>
-            <w:r>
-              <w:t>(3.3)</w:t>
-            </w:r>
-          </w:p>
-        </w:tc>
-      </w:tr>
-    </w:tbl>
-    <w:p>
-      <w:r>
-        <w:t>Gdzie:</w:t>
-      </w:r>
-    </w:p>
-    <w:p>
-      <w:r>
-        <w:tab/>
-        <w:t>β – kąt pomiędzy kierunkiem lotu pocisku, a normalną do powierzchni celu [rad]</w:t>
-      </w:r>
-    </w:p>
-    <w:p>
-      <w:r>
-        <w:tab/>
+        <w:t>Pocisk jako ciało sztywne</w:t>
+      </w:r>
+    </w:p>
+    <w:p>
+      <w:r>
+        <w:t xml:space="preserve">Na początku należy określić parametry które są podstawami modelu. Pierwszym jest opór </w:t>
+      </w:r>
+      <w:r>
+        <w:t>materiału celu</w:t>
+      </w:r>
+      <w:r>
+        <w:t xml:space="preserve"> (</w:t>
       </w:r>
       <w:proofErr w:type="spellStart"/>
       <w:r>
-        <w:t>ρ</w:t>
+        <w:t>R</w:t>
       </w:r>
       <w:r>
         <w:rPr>
           <w:vertAlign w:val="subscript"/>
         </w:rPr>
-        <w:t>p</w:t>
+        <w:t>t</w:t>
       </w:r>
       <w:proofErr w:type="spellEnd"/>
       <w:r>
-        <w:rPr>
-          <w:vertAlign w:val="subscript"/>
-        </w:rPr>
+        <w:t>)</w:t>
+      </w:r>
+      <w:r>
+        <w:t>, jest on ciśnieniem jakie wywiera cel przy zderzeniu.</w:t>
+      </w:r>
+      <w:r>
         <w:t xml:space="preserve"> </w:t>
       </w:r>
       <w:r>
-        <w:t>– gęstość pocisku [kg/m</w:t>
-      </w:r>
-      <w:r>
-        <w:rPr>
-          <w:vertAlign w:val="superscript"/>
-        </w:rPr>
-        <w:t>3</w:t>
-      </w:r>
-      <w:r>
-        <w:t>]</w:t>
-      </w:r>
-    </w:p>
-    <w:p>
-      <w:r>
-        <w:tab/>
-        <w:t>V – prędkość pocisku</w:t>
-      </w:r>
-      <w:r>
-        <w:t xml:space="preserve"> w momencie zderzenia</w:t>
-      </w:r>
-      <w:r>
-        <w:t xml:space="preserve"> [m/s]</w:t>
-      </w:r>
-    </w:p>
-    <w:p>
-      <w:pPr>
-        <w:rPr>
-          <w:color w:val="EE0000"/>
-        </w:rPr>
-      </w:pPr>
-      <w:r>
-        <w:tab/>
-      </w:r>
-      <w:r>
-        <w:rPr>
-          <w:color w:val="EE0000"/>
-        </w:rPr>
-        <w:t>U – prędkość wnikania pocisku w materiał</w:t>
-      </w:r>
-      <w:r>
-        <w:rPr>
-          <w:color w:val="EE0000"/>
-        </w:rPr>
-        <w:t xml:space="preserve"> [m/s]</w:t>
-      </w:r>
-    </w:p>
-    <w:p>
-      <w:proofErr w:type="spellStart"/>
-      <w:r>
-        <w:t>R</w:t>
-      </w:r>
-      <w:r>
-        <w:rPr>
-          <w:vertAlign w:val="subscript"/>
-        </w:rPr>
-        <w:t>t</w:t>
-      </w:r>
-      <w:proofErr w:type="spellEnd"/>
-      <w:r>
-        <w:t xml:space="preserve"> to opór</w:t>
-      </w:r>
-      <w:r>
-        <w:t xml:space="preserve"> materiału celu,</w:t>
-      </w:r>
-      <w:r>
-        <w:t xml:space="preserve"> który definiuje się wzorem:</w:t>
+        <w:t>O</w:t>
+      </w:r>
+      <w:r>
+        <w:t>pis</w:t>
+      </w:r>
+      <w:r>
+        <w:t>uje się go</w:t>
+      </w:r>
+      <w:r>
+        <w:t xml:space="preserve"> równaniem:</w:t>
       </w:r>
     </w:p>
     <w:tbl>
@@ -1666,10 +1382,10 @@
               <w:jc w:val="right"/>
             </w:pPr>
             <w:r>
-              <w:t>(</w:t>
+              <w:t>(3.</w:t>
             </w:r>
             <w:r>
-              <w:t>3.4</w:t>
+              <w:t>3</w:t>
             </w:r>
             <w:r>
               <w:t>)</w:t>
@@ -1685,6 +1401,7 @@
     </w:p>
     <w:p>
       <w:r>
+        <w:lastRenderedPageBreak/>
         <w:tab/>
       </w:r>
       <w:proofErr w:type="spellStart"/>
@@ -1726,58 +1443,258 @@
     <w:p>
       <w:r>
         <w:tab/>
-        <w:t xml:space="preserve">Φ – współczynnik określający kształt </w:t>
-      </w:r>
-      <w:r>
-        <w:t>nosa</w:t>
-      </w:r>
-      <w:r>
-        <w:t xml:space="preserve"> pocisku</w:t>
-      </w:r>
-    </w:p>
-    <w:p>
-      <w:r>
-        <w:t xml:space="preserve">Jeżeli warunek rykoszetu jest spełniony to pocisk </w:t>
-      </w:r>
-      <w:r>
-        <w:t>kontynuuje swój ruch</w:t>
-      </w:r>
-      <w:r>
-        <w:t>, tracąc</w:t>
-      </w:r>
-      <w:r>
-        <w:t xml:space="preserve"> znaczną</w:t>
-      </w:r>
-      <w:r>
-        <w:t xml:space="preserve"> cz</w:t>
-      </w:r>
-      <w:r>
-        <w:t>ę</w:t>
-      </w:r>
-      <w:r>
-        <w:t>ść składowej prędkości w kierunku normalnej do powierzchni celu</w:t>
-      </w:r>
-      <w:r>
-        <w:t>. W przeciwnym przypadku pocisk nie zrykoszetuje</w:t>
-      </w:r>
-      <w:r>
-        <w:t>,</w:t>
-      </w:r>
-      <w:r>
-        <w:t xml:space="preserve"> a spróbuje spenetrować cel</w:t>
-      </w:r>
-      <w:r>
-        <w:t xml:space="preserve">. Jeżeli </w:t>
-      </w:r>
-      <w:r>
-        <w:t>dynamiczna granica plastyczności materiału pocisku</w:t>
+        <w:t>Φ – współczynnik kształt</w:t>
+      </w:r>
+      <w:r>
+        <w:t>u</w:t>
+      </w:r>
+      <w:r>
+        <w:t xml:space="preserve"> nosa pocisku</w:t>
+      </w:r>
+    </w:p>
+    <w:p>
+      <w:r>
+        <w:t>Drugim parametrem jest</w:t>
+      </w:r>
+      <w:r>
+        <w:t xml:space="preserve"> efektywna</w:t>
+      </w:r>
+      <w:r>
+        <w:t xml:space="preserve"> długość pocisku</w:t>
+      </w:r>
+      <w:r>
+        <w:t xml:space="preserve"> (</w:t>
+      </w:r>
+      <w:proofErr w:type="spellStart"/>
+      <w:r>
+        <w:t>L</w:t>
+      </w:r>
+      <w:r>
+        <w:rPr>
+          <w:vertAlign w:val="subscript"/>
+        </w:rPr>
+        <w:t>eff</w:t>
+      </w:r>
+      <w:proofErr w:type="spellEnd"/>
+      <w:r>
+        <w:t>)</w:t>
+      </w:r>
+      <w:r>
+        <w:t xml:space="preserve">, </w:t>
+      </w:r>
+      <w:r>
+        <w:t xml:space="preserve">odpowiada ona długości zastępczego walca o objętości oraz </w:t>
+      </w:r>
+      <w:r>
+        <w:t>promieniu</w:t>
       </w:r>
       <w:r>
         <w:t xml:space="preserve"> </w:t>
       </w:r>
+      <w:r>
+        <w:t xml:space="preserve">pocisku. </w:t>
+      </w:r>
+      <w:r>
+        <w:t>Wyrażenie geometrii w ten sposób upraszcza uwzględnienie bezwładności pocisku w równaniach:</w:t>
+      </w:r>
+    </w:p>
+    <w:tbl>
+      <w:tblPr>
+        <w:tblStyle w:val="TableGrid"/>
+        <w:tblW w:w="0" w:type="auto"/>
+        <w:tblBorders>
+          <w:top w:val="none" w:sz="0" w:space="0" w:color="auto"/>
+          <w:left w:val="none" w:sz="0" w:space="0" w:color="auto"/>
+          <w:bottom w:val="none" w:sz="0" w:space="0" w:color="auto"/>
+          <w:right w:val="none" w:sz="0" w:space="0" w:color="auto"/>
+          <w:insideH w:val="none" w:sz="0" w:space="0" w:color="auto"/>
+          <w:insideV w:val="none" w:sz="0" w:space="0" w:color="auto"/>
+        </w:tblBorders>
+        <w:tblLook w:val="04A0" w:firstRow="1" w:lastRow="0" w:firstColumn="1" w:lastColumn="0" w:noHBand="0" w:noVBand="1"/>
+      </w:tblPr>
+      <w:tblGrid>
+        <w:gridCol w:w="3209"/>
+        <w:gridCol w:w="3209"/>
+        <w:gridCol w:w="3210"/>
+      </w:tblGrid>
+      <w:tr>
+        <w:tc>
+          <w:tcPr>
+            <w:tcW w:w="3209" w:type="dxa"/>
+          </w:tcPr>
+          <w:p/>
+        </w:tc>
+        <w:tc>
+          <w:tcPr>
+            <w:tcW w:w="3209" w:type="dxa"/>
+            <w:vAlign w:val="center"/>
+          </w:tcPr>
+          <w:p>
+            <w:pPr>
+              <w:jc w:val="center"/>
+            </w:pPr>
+            <m:oMathPara>
+              <m:oMath>
+                <m:sSub>
+                  <m:sSubPr>
+                    <m:ctrlPr>
+                      <w:rPr>
+                        <w:rFonts w:ascii="Cambria Math" w:hAnsi="Cambria Math"/>
+                        <w:i/>
+                      </w:rPr>
+                    </m:ctrlPr>
+                  </m:sSubPr>
+                  <m:e>
+                    <m:r>
+                      <w:rPr>
+                        <w:rFonts w:ascii="Cambria Math" w:hAnsi="Cambria Math"/>
+                      </w:rPr>
+                      <m:t>L</m:t>
+                    </m:r>
+                  </m:e>
+                  <m:sub>
+                    <m:r>
+                      <w:rPr>
+                        <w:rFonts w:ascii="Cambria Math" w:hAnsi="Cambria Math"/>
+                      </w:rPr>
+                      <m:t>eff</m:t>
+                    </m:r>
+                  </m:sub>
+                </m:sSub>
+                <m:r>
+                  <w:rPr>
+                    <w:rFonts w:ascii="Cambria Math" w:hAnsi="Cambria Math"/>
+                  </w:rPr>
+                  <m:t>=</m:t>
+                </m:r>
+                <m:f>
+                  <m:fPr>
+                    <m:ctrlPr>
+                      <w:rPr>
+                        <w:rFonts w:ascii="Cambria Math" w:hAnsi="Cambria Math"/>
+                        <w:i/>
+                      </w:rPr>
+                    </m:ctrlPr>
+                  </m:fPr>
+                  <m:num>
+                    <m:r>
+                      <w:rPr>
+                        <w:rFonts w:ascii="Cambria Math" w:hAnsi="Cambria Math"/>
+                      </w:rPr>
+                      <m:t>m</m:t>
+                    </m:r>
+                  </m:num>
+                  <m:den>
+                    <m:r>
+                      <w:rPr>
+                        <w:rFonts w:ascii="Cambria Math" w:hAnsi="Cambria Math"/>
+                      </w:rPr>
+                      <m:t>π</m:t>
+                    </m:r>
+                    <m:sSup>
+                      <m:sSupPr>
+                        <m:ctrlPr>
+                          <w:rPr>
+                            <w:rFonts w:ascii="Cambria Math" w:hAnsi="Cambria Math"/>
+                            <w:i/>
+                          </w:rPr>
+                        </m:ctrlPr>
+                      </m:sSupPr>
+                      <m:e>
+                        <m:r>
+                          <w:rPr>
+                            <w:rFonts w:ascii="Cambria Math" w:hAnsi="Cambria Math"/>
+                          </w:rPr>
+                          <m:t>r</m:t>
+                        </m:r>
+                      </m:e>
+                      <m:sup>
+                        <m:r>
+                          <w:rPr>
+                            <w:rFonts w:ascii="Cambria Math" w:hAnsi="Cambria Math"/>
+                          </w:rPr>
+                          <m:t>2</m:t>
+                        </m:r>
+                      </m:sup>
+                    </m:sSup>
+                    <m:sSub>
+                      <m:sSubPr>
+                        <m:ctrlPr>
+                          <w:rPr>
+                            <w:rFonts w:ascii="Cambria Math" w:hAnsi="Cambria Math"/>
+                            <w:i/>
+                          </w:rPr>
+                        </m:ctrlPr>
+                      </m:sSubPr>
+                      <m:e>
+                        <m:r>
+                          <w:rPr>
+                            <w:rFonts w:ascii="Cambria Math" w:hAnsi="Cambria Math"/>
+                          </w:rPr>
+                          <m:t>ρ</m:t>
+                        </m:r>
+                      </m:e>
+                      <m:sub>
+                        <m:r>
+                          <w:rPr>
+                            <w:rFonts w:ascii="Cambria Math" w:hAnsi="Cambria Math"/>
+                          </w:rPr>
+                          <m:t>p</m:t>
+                        </m:r>
+                      </m:sub>
+                    </m:sSub>
+                  </m:den>
+                </m:f>
+              </m:oMath>
+            </m:oMathPara>
+          </w:p>
+        </w:tc>
+        <w:tc>
+          <w:tcPr>
+            <w:tcW w:w="3210" w:type="dxa"/>
+            <w:vAlign w:val="center"/>
+          </w:tcPr>
+          <w:p>
+            <w:pPr>
+              <w:jc w:val="right"/>
+            </w:pPr>
+            <w:r>
+              <w:t>(</w:t>
+            </w:r>
+            <w:r>
+              <w:t>3.</w:t>
+            </w:r>
+            <w:r>
+              <w:t>4)</w:t>
+            </w:r>
+          </w:p>
+        </w:tc>
+      </w:tr>
+    </w:tbl>
+    <w:p>
+      <w:r>
+        <w:t>Gdzie:</w:t>
+      </w:r>
+    </w:p>
+    <w:p>
+      <w:r>
+        <w:tab/>
+        <w:t>m – masa pocisku [kg]</w:t>
+      </w:r>
+    </w:p>
+    <w:p>
+      <w:r>
+        <w:tab/>
+        <w:t>r – promień pocisku [m]</w:t>
+      </w:r>
+    </w:p>
+    <w:p>
+      <w:r>
+        <w:tab/>
+      </w:r>
       <w:proofErr w:type="spellStart"/>
       <w:r>
-        <w:t>Y</w:t>
+        <w:t>ρ</w:t>
       </w:r>
       <w:r>
         <w:rPr>
@@ -1787,19 +1704,1399 @@
       </w:r>
       <w:proofErr w:type="spellEnd"/>
       <w:r>
+        <w:rPr>
+          <w:vertAlign w:val="subscript"/>
+        </w:rPr>
         <w:t xml:space="preserve"> </w:t>
       </w:r>
       <w:r>
-        <w:t>jest większa od</w:t>
-      </w:r>
-      <w:r>
-        <w:t xml:space="preserve"> oporu celu</w:t>
+        <w:t>– gęstość pocisku [kg/m</w:t>
+      </w:r>
+      <w:r>
+        <w:rPr>
+          <w:vertAlign w:val="superscript"/>
+        </w:rPr>
+        <w:t>3</w:t>
+      </w:r>
+      <w:r>
+        <w:t>]</w:t>
+      </w:r>
+    </w:p>
+    <w:p>
+      <w:r>
+        <w:t>Podczas kontaktu pocisku z celem w pierwszej kolejności należy obliczyć warunek rykoszetu</w:t>
+      </w:r>
+      <w:r>
+        <w:t>.</w:t>
+      </w:r>
+      <w:r>
+        <w:t xml:space="preserve"> Jest on opisany nierównością:</w:t>
+      </w:r>
+    </w:p>
+    <w:tbl>
+      <w:tblPr>
+        <w:tblStyle w:val="TableGrid"/>
+        <w:tblW w:w="0" w:type="auto"/>
+        <w:tblBorders>
+          <w:top w:val="none" w:sz="0" w:space="0" w:color="auto"/>
+          <w:left w:val="none" w:sz="0" w:space="0" w:color="auto"/>
+          <w:bottom w:val="none" w:sz="0" w:space="0" w:color="auto"/>
+          <w:right w:val="none" w:sz="0" w:space="0" w:color="auto"/>
+          <w:insideH w:val="none" w:sz="0" w:space="0" w:color="auto"/>
+          <w:insideV w:val="none" w:sz="0" w:space="0" w:color="auto"/>
+        </w:tblBorders>
+        <w:tblLook w:val="04A0" w:firstRow="1" w:lastRow="0" w:firstColumn="1" w:lastColumn="0" w:noHBand="0" w:noVBand="1"/>
+      </w:tblPr>
+      <w:tblGrid>
+        <w:gridCol w:w="3209"/>
+        <w:gridCol w:w="3209"/>
+        <w:gridCol w:w="3210"/>
+      </w:tblGrid>
+      <w:tr>
+        <w:tc>
+          <w:tcPr>
+            <w:tcW w:w="3209" w:type="dxa"/>
+          </w:tcPr>
+          <w:p/>
+        </w:tc>
+        <w:tc>
+          <w:tcPr>
+            <w:tcW w:w="3209" w:type="dxa"/>
+          </w:tcPr>
+          <w:p>
+            <m:oMathPara>
+              <m:oMath>
+                <m:func>
+                  <m:funcPr>
+                    <m:ctrlPr>
+                      <w:rPr>
+                        <w:rFonts w:ascii="Cambria Math" w:hAnsi="Cambria Math"/>
+                        <w:i/>
+                      </w:rPr>
+                    </m:ctrlPr>
+                  </m:funcPr>
+                  <m:fName>
+                    <m:sSup>
+                      <m:sSupPr>
+                        <m:ctrlPr>
+                          <w:rPr>
+                            <w:rFonts w:ascii="Cambria Math" w:hAnsi="Cambria Math"/>
+                            <w:i/>
+                          </w:rPr>
+                        </m:ctrlPr>
+                      </m:sSupPr>
+                      <m:e>
+                        <m:r>
+                          <m:rPr>
+                            <m:sty m:val="p"/>
+                          </m:rPr>
+                          <w:rPr>
+                            <w:rFonts w:ascii="Cambria Math" w:hAnsi="Cambria Math"/>
+                          </w:rPr>
+                          <m:t>tan</m:t>
+                        </m:r>
+                        <m:ctrlPr>
+                          <w:rPr>
+                            <w:rFonts w:ascii="Cambria Math" w:hAnsi="Cambria Math"/>
+                          </w:rPr>
+                        </m:ctrlPr>
+                      </m:e>
+                      <m:sup>
+                        <m:r>
+                          <w:rPr>
+                            <w:rFonts w:ascii="Cambria Math" w:hAnsi="Cambria Math"/>
+                          </w:rPr>
+                          <m:t>2</m:t>
+                        </m:r>
+                        <m:ctrlPr>
+                          <w:rPr>
+                            <w:rFonts w:ascii="Cambria Math" w:hAnsi="Cambria Math"/>
+                          </w:rPr>
+                        </m:ctrlPr>
+                      </m:sup>
+                    </m:sSup>
+                  </m:fName>
+                  <m:e>
+                    <m:r>
+                      <w:rPr>
+                        <w:rFonts w:ascii="Cambria Math" w:hAnsi="Cambria Math"/>
+                      </w:rPr>
+                      <m:t>β</m:t>
+                    </m:r>
+                  </m:e>
+                </m:func>
+                <m:r>
+                  <w:rPr>
+                    <w:rFonts w:ascii="Cambria Math" w:hAnsi="Cambria Math"/>
+                  </w:rPr>
+                  <m:t>&gt;</m:t>
+                </m:r>
+                <m:f>
+                  <m:fPr>
+                    <m:ctrlPr>
+                      <w:rPr>
+                        <w:rFonts w:ascii="Cambria Math" w:hAnsi="Cambria Math"/>
+                        <w:i/>
+                      </w:rPr>
+                    </m:ctrlPr>
+                  </m:fPr>
+                  <m:num>
+                    <m:sSub>
+                      <m:sSubPr>
+                        <m:ctrlPr>
+                          <w:rPr>
+                            <w:rFonts w:ascii="Cambria Math" w:hAnsi="Cambria Math"/>
+                            <w:i/>
+                          </w:rPr>
+                        </m:ctrlPr>
+                      </m:sSubPr>
+                      <m:e>
+                        <m:r>
+                          <w:rPr>
+                            <w:rFonts w:ascii="Cambria Math" w:hAnsi="Cambria Math"/>
+                          </w:rPr>
+                          <m:t>ρ</m:t>
+                        </m:r>
+                      </m:e>
+                      <m:sub>
+                        <m:r>
+                          <w:rPr>
+                            <w:rFonts w:ascii="Cambria Math" w:hAnsi="Cambria Math"/>
+                          </w:rPr>
+                          <m:t>p</m:t>
+                        </m:r>
+                      </m:sub>
+                    </m:sSub>
+                    <m:sSup>
+                      <m:sSupPr>
+                        <m:ctrlPr>
+                          <w:rPr>
+                            <w:rFonts w:ascii="Cambria Math" w:hAnsi="Cambria Math"/>
+                            <w:i/>
+                          </w:rPr>
+                        </m:ctrlPr>
+                      </m:sSupPr>
+                      <m:e>
+                        <m:r>
+                          <w:rPr>
+                            <w:rFonts w:ascii="Cambria Math" w:hAnsi="Cambria Math"/>
+                          </w:rPr>
+                          <m:t>V</m:t>
+                        </m:r>
+                      </m:e>
+                      <m:sup>
+                        <m:r>
+                          <w:rPr>
+                            <w:rFonts w:ascii="Cambria Math" w:hAnsi="Cambria Math"/>
+                          </w:rPr>
+                          <m:t>2</m:t>
+                        </m:r>
+                      </m:sup>
+                    </m:sSup>
+                  </m:num>
+                  <m:den>
+                    <m:sSub>
+                      <m:sSubPr>
+                        <m:ctrlPr>
+                          <w:rPr>
+                            <w:rFonts w:ascii="Cambria Math" w:hAnsi="Cambria Math"/>
+                            <w:i/>
+                          </w:rPr>
+                        </m:ctrlPr>
+                      </m:sSubPr>
+                      <m:e>
+                        <m:r>
+                          <w:rPr>
+                            <w:rFonts w:ascii="Cambria Math" w:hAnsi="Cambria Math"/>
+                          </w:rPr>
+                          <m:t>R</m:t>
+                        </m:r>
+                      </m:e>
+                      <m:sub>
+                        <m:r>
+                          <w:rPr>
+                            <w:rFonts w:ascii="Cambria Math" w:hAnsi="Cambria Math"/>
+                          </w:rPr>
+                          <m:t>t</m:t>
+                        </m:r>
+                      </m:sub>
+                    </m:sSub>
+                  </m:den>
+                </m:f>
+              </m:oMath>
+            </m:oMathPara>
+          </w:p>
+        </w:tc>
+        <w:tc>
+          <w:tcPr>
+            <w:tcW w:w="3210" w:type="dxa"/>
+            <w:vAlign w:val="center"/>
+          </w:tcPr>
+          <w:p>
+            <w:pPr>
+              <w:tabs>
+                <w:tab w:val="left" w:pos="864"/>
+              </w:tabs>
+              <w:jc w:val="right"/>
+            </w:pPr>
+            <w:r>
+              <w:t>(3.</w:t>
+            </w:r>
+            <w:r>
+              <w:t>5</w:t>
+            </w:r>
+            <w:r>
+              <w:t>)</w:t>
+            </w:r>
+          </w:p>
+        </w:tc>
+      </w:tr>
+    </w:tbl>
+    <w:p>
+      <w:r>
+        <w:t>Gdzie:</w:t>
+      </w:r>
+    </w:p>
+    <w:p>
+      <w:r>
+        <w:tab/>
+        <w:t>β – kąt pomiędzy kierunkiem lotu pocisku, a normalną do powierzchni celu [rad]</w:t>
+      </w:r>
+    </w:p>
+    <w:p>
+      <w:r>
+        <w:tab/>
+        <w:t>V – prędkość pocisku w momencie zderzenia [m/s]</w:t>
+      </w:r>
+    </w:p>
+    <w:p>
+      <w:r>
+        <w:t xml:space="preserve">Jeżeli nierówność jest spełniona, dojdzie do rykoszetu, w przeciwnym razie pocisk </w:t>
+      </w:r>
+      <w:r>
+        <w:t>spenetruje cel, a głębokość penetracji można opisać wzorem:</w:t>
+      </w:r>
+    </w:p>
+    <w:tbl>
+      <w:tblPr>
+        <w:tblStyle w:val="TableGrid"/>
+        <w:tblW w:w="0" w:type="auto"/>
+        <w:tblBorders>
+          <w:top w:val="none" w:sz="0" w:space="0" w:color="auto"/>
+          <w:left w:val="none" w:sz="0" w:space="0" w:color="auto"/>
+          <w:bottom w:val="none" w:sz="0" w:space="0" w:color="auto"/>
+          <w:right w:val="none" w:sz="0" w:space="0" w:color="auto"/>
+          <w:insideH w:val="none" w:sz="0" w:space="0" w:color="auto"/>
+          <w:insideV w:val="none" w:sz="0" w:space="0" w:color="auto"/>
+        </w:tblBorders>
+        <w:tblLook w:val="04A0" w:firstRow="1" w:lastRow="0" w:firstColumn="1" w:lastColumn="0" w:noHBand="0" w:noVBand="1"/>
+      </w:tblPr>
+      <w:tblGrid>
+        <w:gridCol w:w="3209"/>
+        <w:gridCol w:w="3209"/>
+        <w:gridCol w:w="3210"/>
+      </w:tblGrid>
+      <w:tr>
+        <w:tc>
+          <w:tcPr>
+            <w:tcW w:w="3209" w:type="dxa"/>
+          </w:tcPr>
+          <w:p/>
+        </w:tc>
+        <w:tc>
+          <w:tcPr>
+            <w:tcW w:w="3209" w:type="dxa"/>
+            <w:vAlign w:val="center"/>
+          </w:tcPr>
+          <w:p>
+            <w:pPr>
+              <w:jc w:val="center"/>
+            </w:pPr>
+            <m:oMathPara>
+              <m:oMath>
+                <m:r>
+                  <w:rPr>
+                    <w:rFonts w:ascii="Cambria Math" w:hAnsi="Cambria Math"/>
+                  </w:rPr>
+                  <m:t>P=</m:t>
+                </m:r>
+                <m:f>
+                  <m:fPr>
+                    <m:ctrlPr>
+                      <w:rPr>
+                        <w:rFonts w:ascii="Cambria Math" w:hAnsi="Cambria Math"/>
+                        <w:i/>
+                      </w:rPr>
+                    </m:ctrlPr>
+                  </m:fPr>
+                  <m:num>
+                    <m:sSub>
+                      <m:sSubPr>
+                        <m:ctrlPr>
+                          <w:rPr>
+                            <w:rFonts w:ascii="Cambria Math" w:hAnsi="Cambria Math"/>
+                            <w:i/>
+                          </w:rPr>
+                        </m:ctrlPr>
+                      </m:sSubPr>
+                      <m:e>
+                        <m:r>
+                          <w:rPr>
+                            <w:rFonts w:ascii="Cambria Math" w:hAnsi="Cambria Math"/>
+                          </w:rPr>
+                          <m:t>ρ</m:t>
+                        </m:r>
+                      </m:e>
+                      <m:sub>
+                        <m:r>
+                          <w:rPr>
+                            <w:rFonts w:ascii="Cambria Math" w:hAnsi="Cambria Math"/>
+                          </w:rPr>
+                          <m:t>p</m:t>
+                        </m:r>
+                      </m:sub>
+                    </m:sSub>
+                    <m:sSub>
+                      <m:sSubPr>
+                        <m:ctrlPr>
+                          <w:rPr>
+                            <w:rFonts w:ascii="Cambria Math" w:hAnsi="Cambria Math"/>
+                            <w:i/>
+                          </w:rPr>
+                        </m:ctrlPr>
+                      </m:sSubPr>
+                      <m:e>
+                        <m:r>
+                          <w:rPr>
+                            <w:rFonts w:ascii="Cambria Math" w:hAnsi="Cambria Math"/>
+                          </w:rPr>
+                          <m:t>L</m:t>
+                        </m:r>
+                      </m:e>
+                      <m:sub>
+                        <m:r>
+                          <w:rPr>
+                            <w:rFonts w:ascii="Cambria Math" w:hAnsi="Cambria Math"/>
+                          </w:rPr>
+                          <m:t>eff</m:t>
+                        </m:r>
+                      </m:sub>
+                    </m:sSub>
+                    <m:sSup>
+                      <m:sSupPr>
+                        <m:ctrlPr>
+                          <w:rPr>
+                            <w:rFonts w:ascii="Cambria Math" w:hAnsi="Cambria Math"/>
+                            <w:i/>
+                          </w:rPr>
+                        </m:ctrlPr>
+                      </m:sSupPr>
+                      <m:e>
+                        <m:r>
+                          <w:rPr>
+                            <w:rFonts w:ascii="Cambria Math" w:hAnsi="Cambria Math"/>
+                          </w:rPr>
+                          <m:t>V</m:t>
+                        </m:r>
+                      </m:e>
+                      <m:sup>
+                        <m:r>
+                          <w:rPr>
+                            <w:rFonts w:ascii="Cambria Math" w:hAnsi="Cambria Math"/>
+                          </w:rPr>
+                          <m:t>2</m:t>
+                        </m:r>
+                      </m:sup>
+                    </m:sSup>
+                  </m:num>
+                  <m:den>
+                    <m:r>
+                      <w:rPr>
+                        <w:rFonts w:ascii="Cambria Math" w:hAnsi="Cambria Math"/>
+                      </w:rPr>
+                      <m:t>2</m:t>
+                    </m:r>
+                    <m:sSub>
+                      <m:sSubPr>
+                        <m:ctrlPr>
+                          <w:rPr>
+                            <w:rFonts w:ascii="Cambria Math" w:hAnsi="Cambria Math"/>
+                            <w:i/>
+                          </w:rPr>
+                        </m:ctrlPr>
+                      </m:sSubPr>
+                      <m:e>
+                        <m:r>
+                          <w:rPr>
+                            <w:rFonts w:ascii="Cambria Math" w:hAnsi="Cambria Math"/>
+                          </w:rPr>
+                          <m:t>R</m:t>
+                        </m:r>
+                      </m:e>
+                      <m:sub>
+                        <m:r>
+                          <w:rPr>
+                            <w:rFonts w:ascii="Cambria Math" w:hAnsi="Cambria Math"/>
+                          </w:rPr>
+                          <m:t>t</m:t>
+                        </m:r>
+                      </m:sub>
+                    </m:sSub>
+                  </m:den>
+                </m:f>
+              </m:oMath>
+            </m:oMathPara>
+          </w:p>
+        </w:tc>
+        <w:tc>
+          <w:tcPr>
+            <w:tcW w:w="3210" w:type="dxa"/>
+            <w:vAlign w:val="center"/>
+          </w:tcPr>
+          <w:p>
+            <w:pPr>
+              <w:jc w:val="right"/>
+            </w:pPr>
+            <w:r>
+              <w:t>(</w:t>
+            </w:r>
+            <w:r>
+              <w:t>3.</w:t>
+            </w:r>
+            <w:r>
+              <w:t>6)</w:t>
+            </w:r>
+          </w:p>
+        </w:tc>
+      </w:tr>
+    </w:tbl>
+    <w:p>
+      <w:r>
+        <w:t>Podstawiając za długość penetracji (P) grubość celu</w:t>
+      </w:r>
+      <w:r>
+        <w:t xml:space="preserve"> (H)</w:t>
+      </w:r>
+      <w:r>
+        <w:t xml:space="preserve"> można wyprowadzić minimalną prędkość pocisku</w:t>
       </w:r>
       <w:r>
         <w:t xml:space="preserve"> </w:t>
       </w:r>
+      <w:r>
+        <w:t>(</w:t>
+      </w:r>
       <w:proofErr w:type="spellStart"/>
       <w:r>
+        <w:t>V</w:t>
+      </w:r>
+      <w:r>
+        <w:rPr>
+          <w:vertAlign w:val="subscript"/>
+        </w:rPr>
+        <w:t>bl</w:t>
+      </w:r>
+      <w:proofErr w:type="spellEnd"/>
+      <w:r>
+        <w:t>) potrzebną</w:t>
+      </w:r>
+      <w:r>
+        <w:t>, aby przebić cel</w:t>
+      </w:r>
+      <w:r>
+        <w:t xml:space="preserve"> wyrażoną wzorem:</w:t>
+      </w:r>
+    </w:p>
+    <w:tbl>
+      <w:tblPr>
+        <w:tblStyle w:val="TableGrid"/>
+        <w:tblW w:w="0" w:type="auto"/>
+        <w:tblBorders>
+          <w:top w:val="none" w:sz="0" w:space="0" w:color="auto"/>
+          <w:left w:val="none" w:sz="0" w:space="0" w:color="auto"/>
+          <w:bottom w:val="none" w:sz="0" w:space="0" w:color="auto"/>
+          <w:right w:val="none" w:sz="0" w:space="0" w:color="auto"/>
+          <w:insideH w:val="none" w:sz="0" w:space="0" w:color="auto"/>
+          <w:insideV w:val="none" w:sz="0" w:space="0" w:color="auto"/>
+        </w:tblBorders>
+        <w:tblLook w:val="04A0" w:firstRow="1" w:lastRow="0" w:firstColumn="1" w:lastColumn="0" w:noHBand="0" w:noVBand="1"/>
+      </w:tblPr>
+      <w:tblGrid>
+        <w:gridCol w:w="3209"/>
+        <w:gridCol w:w="3209"/>
+        <w:gridCol w:w="3210"/>
+      </w:tblGrid>
+      <w:tr>
+        <w:tc>
+          <w:tcPr>
+            <w:tcW w:w="3209" w:type="dxa"/>
+          </w:tcPr>
+          <w:p/>
+        </w:tc>
+        <w:tc>
+          <w:tcPr>
+            <w:tcW w:w="3209" w:type="dxa"/>
+          </w:tcPr>
+          <w:p>
+            <m:oMathPara>
+              <m:oMath>
+                <m:sSub>
+                  <m:sSubPr>
+                    <m:ctrlPr>
+                      <w:rPr>
+                        <w:rFonts w:ascii="Cambria Math" w:hAnsi="Cambria Math"/>
+                        <w:i/>
+                      </w:rPr>
+                    </m:ctrlPr>
+                  </m:sSubPr>
+                  <m:e>
+                    <m:r>
+                      <w:rPr>
+                        <w:rFonts w:ascii="Cambria Math" w:hAnsi="Cambria Math"/>
+                      </w:rPr>
+                      <m:t>V</m:t>
+                    </m:r>
+                  </m:e>
+                  <m:sub>
+                    <m:r>
+                      <w:rPr>
+                        <w:rFonts w:ascii="Cambria Math" w:hAnsi="Cambria Math"/>
+                      </w:rPr>
+                      <m:t>bl</m:t>
+                    </m:r>
+                  </m:sub>
+                </m:sSub>
+                <m:r>
+                  <w:rPr>
+                    <w:rFonts w:ascii="Cambria Math" w:hAnsi="Cambria Math"/>
+                  </w:rPr>
+                  <m:t>=</m:t>
+                </m:r>
+                <m:rad>
+                  <m:radPr>
+                    <m:degHide m:val="1"/>
+                    <m:ctrlPr>
+                      <w:rPr>
+                        <w:rFonts w:ascii="Cambria Math" w:hAnsi="Cambria Math"/>
+                        <w:i/>
+                      </w:rPr>
+                    </m:ctrlPr>
+                  </m:radPr>
+                  <m:deg/>
+                  <m:e>
+                    <m:f>
+                      <m:fPr>
+                        <m:ctrlPr>
+                          <w:rPr>
+                            <w:rFonts w:ascii="Cambria Math" w:hAnsi="Cambria Math"/>
+                            <w:i/>
+                          </w:rPr>
+                        </m:ctrlPr>
+                      </m:fPr>
+                      <m:num>
+                        <m:r>
+                          <w:rPr>
+                            <w:rFonts w:ascii="Cambria Math" w:hAnsi="Cambria Math"/>
+                          </w:rPr>
+                          <m:t>2H</m:t>
+                        </m:r>
+                        <m:sSub>
+                          <m:sSubPr>
+                            <m:ctrlPr>
+                              <w:rPr>
+                                <w:rFonts w:ascii="Cambria Math" w:hAnsi="Cambria Math"/>
+                                <w:i/>
+                              </w:rPr>
+                            </m:ctrlPr>
+                          </m:sSubPr>
+                          <m:e>
+                            <m:r>
+                              <w:rPr>
+                                <w:rFonts w:ascii="Cambria Math" w:hAnsi="Cambria Math"/>
+                              </w:rPr>
+                              <m:t>R</m:t>
+                            </m:r>
+                          </m:e>
+                          <m:sub>
+                            <m:r>
+                              <w:rPr>
+                                <w:rFonts w:ascii="Cambria Math" w:hAnsi="Cambria Math"/>
+                              </w:rPr>
+                              <m:t>t</m:t>
+                            </m:r>
+                          </m:sub>
+                        </m:sSub>
+                      </m:num>
+                      <m:den>
+                        <m:sSub>
+                          <m:sSubPr>
+                            <m:ctrlPr>
+                              <w:rPr>
+                                <w:rFonts w:ascii="Cambria Math" w:hAnsi="Cambria Math"/>
+                                <w:i/>
+                              </w:rPr>
+                            </m:ctrlPr>
+                          </m:sSubPr>
+                          <m:e>
+                            <m:r>
+                              <w:rPr>
+                                <w:rFonts w:ascii="Cambria Math" w:hAnsi="Cambria Math"/>
+                              </w:rPr>
+                              <m:t>ρ</m:t>
+                            </m:r>
+                          </m:e>
+                          <m:sub>
+                            <m:r>
+                              <w:rPr>
+                                <w:rFonts w:ascii="Cambria Math" w:hAnsi="Cambria Math"/>
+                              </w:rPr>
+                              <m:t>p</m:t>
+                            </m:r>
+                          </m:sub>
+                        </m:sSub>
+                        <m:sSub>
+                          <m:sSubPr>
+                            <m:ctrlPr>
+                              <w:rPr>
+                                <w:rFonts w:ascii="Cambria Math" w:hAnsi="Cambria Math"/>
+                                <w:i/>
+                              </w:rPr>
+                            </m:ctrlPr>
+                          </m:sSubPr>
+                          <m:e>
+                            <m:r>
+                              <w:rPr>
+                                <w:rFonts w:ascii="Cambria Math" w:hAnsi="Cambria Math"/>
+                              </w:rPr>
+                              <m:t>L</m:t>
+                            </m:r>
+                          </m:e>
+                          <m:sub>
+                            <m:r>
+                              <w:rPr>
+                                <w:rFonts w:ascii="Cambria Math" w:hAnsi="Cambria Math"/>
+                              </w:rPr>
+                              <m:t>eff</m:t>
+                            </m:r>
+                          </m:sub>
+                        </m:sSub>
+                      </m:den>
+                    </m:f>
+                  </m:e>
+                </m:rad>
+              </m:oMath>
+            </m:oMathPara>
+          </w:p>
+        </w:tc>
+        <w:tc>
+          <w:tcPr>
+            <w:tcW w:w="3210" w:type="dxa"/>
+            <w:vAlign w:val="center"/>
+          </w:tcPr>
+          <w:p>
+            <w:pPr>
+              <w:jc w:val="right"/>
+            </w:pPr>
+            <w:r>
+              <w:t>(3.7)</w:t>
+            </w:r>
+          </w:p>
+        </w:tc>
+      </w:tr>
+    </w:tbl>
+    <w:p>
+      <w:r>
+        <w:t xml:space="preserve">Jeżeli prędkość pocisku jest mniejsza niż </w:t>
+      </w:r>
+      <w:proofErr w:type="spellStart"/>
+      <w:r>
+        <w:t>V</w:t>
+      </w:r>
+      <w:r>
+        <w:rPr>
+          <w:vertAlign w:val="subscript"/>
+        </w:rPr>
+        <w:t>bl</w:t>
+      </w:r>
+      <w:proofErr w:type="spellEnd"/>
+      <w:r>
+        <w:t xml:space="preserve"> pocisk spenetruje cel, ale go nie przebije.</w:t>
+      </w:r>
+      <w:r>
+        <w:t xml:space="preserve"> Jeżeli jest wyższa </w:t>
+      </w:r>
+      <w:r>
+        <w:t xml:space="preserve">pocisk przebije cel i opuści </w:t>
+      </w:r>
+      <w:r>
+        <w:t>go z</w:t>
+      </w:r>
+      <w:r>
+        <w:t xml:space="preserve"> mniejszą prędkością niż w momencie kontaktu. Prędkość po przejściu przez cel (</w:t>
+      </w:r>
+      <w:proofErr w:type="spellStart"/>
+      <w:r>
+        <w:t>V</w:t>
+      </w:r>
+      <w:r>
+        <w:rPr>
+          <w:vertAlign w:val="subscript"/>
+        </w:rPr>
+        <w:t>r</w:t>
+      </w:r>
+      <w:proofErr w:type="spellEnd"/>
+      <w:r>
+        <w:t>) można wyprowadzić z bilansu energii kinetycznej:</w:t>
+      </w:r>
+    </w:p>
+    <w:tbl>
+      <w:tblPr>
+        <w:tblStyle w:val="TableGrid"/>
+        <w:tblW w:w="0" w:type="auto"/>
+        <w:tblBorders>
+          <w:top w:val="none" w:sz="0" w:space="0" w:color="auto"/>
+          <w:left w:val="none" w:sz="0" w:space="0" w:color="auto"/>
+          <w:bottom w:val="none" w:sz="0" w:space="0" w:color="auto"/>
+          <w:right w:val="none" w:sz="0" w:space="0" w:color="auto"/>
+          <w:insideH w:val="none" w:sz="0" w:space="0" w:color="auto"/>
+          <w:insideV w:val="none" w:sz="0" w:space="0" w:color="auto"/>
+        </w:tblBorders>
+        <w:tblLook w:val="04A0" w:firstRow="1" w:lastRow="0" w:firstColumn="1" w:lastColumn="0" w:noHBand="0" w:noVBand="1"/>
+      </w:tblPr>
+      <w:tblGrid>
+        <w:gridCol w:w="3209"/>
+        <w:gridCol w:w="3209"/>
+        <w:gridCol w:w="3210"/>
+      </w:tblGrid>
+      <w:tr>
+        <w:tc>
+          <w:tcPr>
+            <w:tcW w:w="3209" w:type="dxa"/>
+          </w:tcPr>
+          <w:p/>
+        </w:tc>
+        <w:tc>
+          <w:tcPr>
+            <w:tcW w:w="3209" w:type="dxa"/>
+          </w:tcPr>
+          <w:p>
+            <w:pPr>
+              <w:rPr>
+                <w:rFonts w:ascii="Cambria Math" w:hAnsi="Cambria Math"/>
+                <w:i/>
+              </w:rPr>
+            </w:pPr>
+            <m:oMathPara>
+              <m:oMath>
+                <m:f>
+                  <m:fPr>
+                    <m:ctrlPr>
+                      <w:rPr>
+                        <w:rFonts w:ascii="Cambria Math" w:hAnsi="Cambria Math"/>
+                        <w:i/>
+                      </w:rPr>
+                    </m:ctrlPr>
+                  </m:fPr>
+                  <m:num>
+                    <m:r>
+                      <w:rPr>
+                        <w:rFonts w:ascii="Cambria Math" w:hAnsi="Cambria Math"/>
+                      </w:rPr>
+                      <m:t>m</m:t>
+                    </m:r>
+                    <m:sSup>
+                      <m:sSupPr>
+                        <m:ctrlPr>
+                          <w:rPr>
+                            <w:rFonts w:ascii="Cambria Math" w:hAnsi="Cambria Math"/>
+                            <w:i/>
+                          </w:rPr>
+                        </m:ctrlPr>
+                      </m:sSupPr>
+                      <m:e>
+                        <m:r>
+                          <w:rPr>
+                            <w:rFonts w:ascii="Cambria Math" w:hAnsi="Cambria Math"/>
+                          </w:rPr>
+                          <m:t>V</m:t>
+                        </m:r>
+                      </m:e>
+                      <m:sup>
+                        <m:r>
+                          <w:rPr>
+                            <w:rFonts w:ascii="Cambria Math" w:hAnsi="Cambria Math"/>
+                          </w:rPr>
+                          <m:t>2</m:t>
+                        </m:r>
+                      </m:sup>
+                    </m:sSup>
+                  </m:num>
+                  <m:den>
+                    <m:r>
+                      <w:rPr>
+                        <w:rFonts w:ascii="Cambria Math" w:hAnsi="Cambria Math"/>
+                      </w:rPr>
+                      <m:t>2</m:t>
+                    </m:r>
+                  </m:den>
+                </m:f>
+                <m:r>
+                  <w:rPr>
+                    <w:rFonts w:ascii="Cambria Math" w:hAnsi="Cambria Math"/>
+                  </w:rPr>
+                  <m:t>=</m:t>
+                </m:r>
+                <m:f>
+                  <m:fPr>
+                    <m:ctrlPr>
+                      <w:rPr>
+                        <w:rFonts w:ascii="Cambria Math" w:hAnsi="Cambria Math"/>
+                        <w:i/>
+                      </w:rPr>
+                    </m:ctrlPr>
+                  </m:fPr>
+                  <m:num>
+                    <m:r>
+                      <w:rPr>
+                        <w:rFonts w:ascii="Cambria Math" w:hAnsi="Cambria Math"/>
+                      </w:rPr>
+                      <m:t>m</m:t>
+                    </m:r>
+                    <m:sSubSup>
+                      <m:sSubSupPr>
+                        <m:ctrlPr>
+                          <w:rPr>
+                            <w:rFonts w:ascii="Cambria Math" w:hAnsi="Cambria Math"/>
+                            <w:i/>
+                          </w:rPr>
+                        </m:ctrlPr>
+                      </m:sSubSupPr>
+                      <m:e>
+                        <m:r>
+                          <w:rPr>
+                            <w:rFonts w:ascii="Cambria Math" w:hAnsi="Cambria Math"/>
+                          </w:rPr>
+                          <m:t>V</m:t>
+                        </m:r>
+                      </m:e>
+                      <m:sub>
+                        <m:r>
+                          <w:rPr>
+                            <w:rFonts w:ascii="Cambria Math" w:hAnsi="Cambria Math"/>
+                          </w:rPr>
+                          <m:t>r</m:t>
+                        </m:r>
+                      </m:sub>
+                      <m:sup>
+                        <m:r>
+                          <w:rPr>
+                            <w:rFonts w:ascii="Cambria Math" w:hAnsi="Cambria Math"/>
+                          </w:rPr>
+                          <m:t>2</m:t>
+                        </m:r>
+                      </m:sup>
+                    </m:sSubSup>
+                  </m:num>
+                  <m:den>
+                    <m:r>
+                      <w:rPr>
+                        <w:rFonts w:ascii="Cambria Math" w:hAnsi="Cambria Math"/>
+                      </w:rPr>
+                      <m:t>2</m:t>
+                    </m:r>
+                  </m:den>
+                </m:f>
+                <m:r>
+                  <w:rPr>
+                    <w:rFonts w:ascii="Cambria Math" w:hAnsi="Cambria Math"/>
+                  </w:rPr>
+                  <m:t>+</m:t>
+                </m:r>
+                <m:sSub>
+                  <m:sSubPr>
+                    <m:ctrlPr>
+                      <w:rPr>
+                        <w:rFonts w:ascii="Cambria Math" w:hAnsi="Cambria Math"/>
+                        <w:i/>
+                      </w:rPr>
+                    </m:ctrlPr>
+                  </m:sSubPr>
+                  <m:e>
+                    <m:r>
+                      <w:rPr>
+                        <w:rFonts w:ascii="Cambria Math" w:hAnsi="Cambria Math"/>
+                      </w:rPr>
+                      <m:t>W</m:t>
+                    </m:r>
+                  </m:e>
+                  <m:sub>
+                    <m:r>
+                      <w:rPr>
+                        <w:rFonts w:ascii="Cambria Math" w:hAnsi="Cambria Math"/>
+                      </w:rPr>
+                      <m:t>p</m:t>
+                    </m:r>
+                  </m:sub>
+                </m:sSub>
+              </m:oMath>
+            </m:oMathPara>
+          </w:p>
+        </w:tc>
+        <w:tc>
+          <w:tcPr>
+            <w:tcW w:w="3210" w:type="dxa"/>
+            <w:vAlign w:val="center"/>
+          </w:tcPr>
+          <w:p>
+            <w:pPr>
+              <w:jc w:val="right"/>
+            </w:pPr>
+            <w:r>
+              <w:t>(3.8)</w:t>
+            </w:r>
+          </w:p>
+        </w:tc>
+      </w:tr>
+    </w:tbl>
+    <w:p>
+      <w:r>
+        <w:t xml:space="preserve">Gdzie </w:t>
+      </w:r>
+      <w:proofErr w:type="spellStart"/>
+      <w:r>
+        <w:t>W</w:t>
+      </w:r>
+      <w:r>
+        <w:rPr>
+          <w:vertAlign w:val="subscript"/>
+        </w:rPr>
+        <w:t>p</w:t>
+      </w:r>
+      <w:proofErr w:type="spellEnd"/>
+      <w:r>
+        <w:t xml:space="preserve"> to praca, którą wykonał pocisk, aby przebić cel, można ją opisać przy użyciu </w:t>
+      </w:r>
+      <w:proofErr w:type="spellStart"/>
+      <w:r>
+        <w:t>V</w:t>
+      </w:r>
+      <w:r>
+        <w:rPr>
+          <w:vertAlign w:val="subscript"/>
+        </w:rPr>
+        <w:t>bl</w:t>
+      </w:r>
+      <w:proofErr w:type="spellEnd"/>
+      <w:r>
+        <w:t xml:space="preserve"> jako:</w:t>
+      </w:r>
+    </w:p>
+    <w:tbl>
+      <w:tblPr>
+        <w:tblStyle w:val="TableGrid"/>
+        <w:tblW w:w="0" w:type="auto"/>
+        <w:tblBorders>
+          <w:top w:val="none" w:sz="0" w:space="0" w:color="auto"/>
+          <w:left w:val="none" w:sz="0" w:space="0" w:color="auto"/>
+          <w:bottom w:val="none" w:sz="0" w:space="0" w:color="auto"/>
+          <w:right w:val="none" w:sz="0" w:space="0" w:color="auto"/>
+          <w:insideH w:val="none" w:sz="0" w:space="0" w:color="auto"/>
+          <w:insideV w:val="none" w:sz="0" w:space="0" w:color="auto"/>
+        </w:tblBorders>
+        <w:tblLook w:val="04A0" w:firstRow="1" w:lastRow="0" w:firstColumn="1" w:lastColumn="0" w:noHBand="0" w:noVBand="1"/>
+      </w:tblPr>
+      <w:tblGrid>
+        <w:gridCol w:w="3209"/>
+        <w:gridCol w:w="3209"/>
+        <w:gridCol w:w="3210"/>
+      </w:tblGrid>
+      <w:tr>
+        <w:tc>
+          <w:tcPr>
+            <w:tcW w:w="3209" w:type="dxa"/>
+          </w:tcPr>
+          <w:p/>
+        </w:tc>
+        <w:tc>
+          <w:tcPr>
+            <w:tcW w:w="3209" w:type="dxa"/>
+          </w:tcPr>
+          <w:p>
+            <m:oMathPara>
+              <m:oMath>
+                <m:sSub>
+                  <m:sSubPr>
+                    <m:ctrlPr>
+                      <w:rPr>
+                        <w:rFonts w:ascii="Cambria Math" w:hAnsi="Cambria Math"/>
+                        <w:i/>
+                      </w:rPr>
+                    </m:ctrlPr>
+                  </m:sSubPr>
+                  <m:e>
+                    <m:r>
+                      <w:rPr>
+                        <w:rFonts w:ascii="Cambria Math" w:hAnsi="Cambria Math"/>
+                      </w:rPr>
+                      <m:t>W</m:t>
+                    </m:r>
+                  </m:e>
+                  <m:sub>
+                    <m:r>
+                      <w:rPr>
+                        <w:rFonts w:ascii="Cambria Math" w:hAnsi="Cambria Math"/>
+                      </w:rPr>
+                      <m:t>p</m:t>
+                    </m:r>
+                  </m:sub>
+                </m:sSub>
+                <m:r>
+                  <w:rPr>
+                    <w:rFonts w:ascii="Cambria Math" w:hAnsi="Cambria Math"/>
+                  </w:rPr>
+                  <m:t>=</m:t>
+                </m:r>
+                <m:f>
+                  <m:fPr>
+                    <m:ctrlPr>
+                      <w:rPr>
+                        <w:rFonts w:ascii="Cambria Math" w:hAnsi="Cambria Math"/>
+                        <w:i/>
+                      </w:rPr>
+                    </m:ctrlPr>
+                  </m:fPr>
+                  <m:num>
+                    <m:r>
+                      <w:rPr>
+                        <w:rFonts w:ascii="Cambria Math" w:hAnsi="Cambria Math"/>
+                      </w:rPr>
+                      <m:t>m</m:t>
+                    </m:r>
+                    <m:sSubSup>
+                      <m:sSubSupPr>
+                        <m:ctrlPr>
+                          <w:rPr>
+                            <w:rFonts w:ascii="Cambria Math" w:hAnsi="Cambria Math"/>
+                            <w:i/>
+                          </w:rPr>
+                        </m:ctrlPr>
+                      </m:sSubSupPr>
+                      <m:e>
+                        <m:r>
+                          <w:rPr>
+                            <w:rFonts w:ascii="Cambria Math" w:hAnsi="Cambria Math"/>
+                          </w:rPr>
+                          <m:t>V</m:t>
+                        </m:r>
+                      </m:e>
+                      <m:sub>
+                        <m:r>
+                          <w:rPr>
+                            <w:rFonts w:ascii="Cambria Math" w:hAnsi="Cambria Math"/>
+                          </w:rPr>
+                          <m:t>bl</m:t>
+                        </m:r>
+                      </m:sub>
+                      <m:sup>
+                        <m:r>
+                          <w:rPr>
+                            <w:rFonts w:ascii="Cambria Math" w:hAnsi="Cambria Math"/>
+                          </w:rPr>
+                          <m:t>2</m:t>
+                        </m:r>
+                      </m:sup>
+                    </m:sSubSup>
+                  </m:num>
+                  <m:den>
+                    <m:r>
+                      <w:rPr>
+                        <w:rFonts w:ascii="Cambria Math" w:hAnsi="Cambria Math"/>
+                      </w:rPr>
+                      <m:t>2</m:t>
+                    </m:r>
+                  </m:den>
+                </m:f>
+              </m:oMath>
+            </m:oMathPara>
+          </w:p>
+        </w:tc>
+        <w:tc>
+          <w:tcPr>
+            <w:tcW w:w="3210" w:type="dxa"/>
+            <w:vAlign w:val="center"/>
+          </w:tcPr>
+          <w:p>
+            <w:pPr>
+              <w:jc w:val="right"/>
+            </w:pPr>
+            <w:r>
+              <w:t>(3.9)</w:t>
+            </w:r>
+          </w:p>
+        </w:tc>
+      </w:tr>
+    </w:tbl>
+    <w:p>
+      <w:r>
+        <w:t>Podstawiając now</w:t>
+      </w:r>
+      <w:r>
+        <w:t>ą</w:t>
+      </w:r>
+      <w:r>
+        <w:t xml:space="preserve"> postać </w:t>
+      </w:r>
+      <w:proofErr w:type="spellStart"/>
+      <w:r>
+        <w:t>W</w:t>
+      </w:r>
+      <w:r>
+        <w:rPr>
+          <w:vertAlign w:val="subscript"/>
+        </w:rPr>
+        <w:t>p</w:t>
+      </w:r>
+      <w:proofErr w:type="spellEnd"/>
+      <w:r>
+        <w:t xml:space="preserve"> do bilansu energii można wyprowadzić zależność </w:t>
+      </w:r>
+      <w:proofErr w:type="spellStart"/>
+      <w:r>
+        <w:t>V</w:t>
+      </w:r>
+      <w:r>
+        <w:rPr>
+          <w:vertAlign w:val="subscript"/>
+        </w:rPr>
+        <w:t>r</w:t>
+      </w:r>
+      <w:proofErr w:type="spellEnd"/>
+      <w:r>
+        <w:rPr>
+          <w:vertAlign w:val="subscript"/>
+        </w:rPr>
+        <w:t xml:space="preserve"> </w:t>
+      </w:r>
+      <w:r>
+        <w:t xml:space="preserve">od </w:t>
+      </w:r>
+      <w:proofErr w:type="spellStart"/>
+      <w:r>
+        <w:t>V</w:t>
+      </w:r>
+      <w:r>
+        <w:rPr>
+          <w:vertAlign w:val="subscript"/>
+        </w:rPr>
+        <w:t>bl</w:t>
+      </w:r>
+      <w:proofErr w:type="spellEnd"/>
+      <w:r>
+        <w:t xml:space="preserve"> i V:</w:t>
+      </w:r>
+    </w:p>
+    <w:tbl>
+      <w:tblPr>
+        <w:tblStyle w:val="TableGrid"/>
+        <w:tblW w:w="0" w:type="auto"/>
+        <w:tblBorders>
+          <w:top w:val="none" w:sz="0" w:space="0" w:color="auto"/>
+          <w:left w:val="none" w:sz="0" w:space="0" w:color="auto"/>
+          <w:bottom w:val="none" w:sz="0" w:space="0" w:color="auto"/>
+          <w:right w:val="none" w:sz="0" w:space="0" w:color="auto"/>
+          <w:insideH w:val="none" w:sz="0" w:space="0" w:color="auto"/>
+          <w:insideV w:val="none" w:sz="0" w:space="0" w:color="auto"/>
+        </w:tblBorders>
+        <w:tblLook w:val="04A0" w:firstRow="1" w:lastRow="0" w:firstColumn="1" w:lastColumn="0" w:noHBand="0" w:noVBand="1"/>
+      </w:tblPr>
+      <w:tblGrid>
+        <w:gridCol w:w="3209"/>
+        <w:gridCol w:w="3209"/>
+        <w:gridCol w:w="3210"/>
+      </w:tblGrid>
+      <w:tr>
+        <w:tc>
+          <w:tcPr>
+            <w:tcW w:w="3209" w:type="dxa"/>
+          </w:tcPr>
+          <w:p/>
+        </w:tc>
+        <w:tc>
+          <w:tcPr>
+            <w:tcW w:w="3209" w:type="dxa"/>
+          </w:tcPr>
+          <w:p>
+            <m:oMathPara>
+              <m:oMath>
+                <m:sSub>
+                  <m:sSubPr>
+                    <m:ctrlPr>
+                      <w:rPr>
+                        <w:rFonts w:ascii="Cambria Math" w:hAnsi="Cambria Math"/>
+                        <w:i/>
+                      </w:rPr>
+                    </m:ctrlPr>
+                  </m:sSubPr>
+                  <m:e>
+                    <m:r>
+                      <w:rPr>
+                        <w:rFonts w:ascii="Cambria Math" w:hAnsi="Cambria Math"/>
+                      </w:rPr>
+                      <m:t>V</m:t>
+                    </m:r>
+                  </m:e>
+                  <m:sub>
+                    <m:r>
+                      <w:rPr>
+                        <w:rFonts w:ascii="Cambria Math" w:hAnsi="Cambria Math"/>
+                      </w:rPr>
+                      <m:t>r</m:t>
+                    </m:r>
+                  </m:sub>
+                </m:sSub>
+                <m:r>
+                  <w:rPr>
+                    <w:rFonts w:ascii="Cambria Math" w:hAnsi="Cambria Math"/>
+                  </w:rPr>
+                  <m:t>=</m:t>
+                </m:r>
+                <m:rad>
+                  <m:radPr>
+                    <m:degHide m:val="1"/>
+                    <m:ctrlPr>
+                      <w:rPr>
+                        <w:rFonts w:ascii="Cambria Math" w:hAnsi="Cambria Math"/>
+                        <w:i/>
+                      </w:rPr>
+                    </m:ctrlPr>
+                  </m:radPr>
+                  <m:deg/>
+                  <m:e>
+                    <m:sSup>
+                      <m:sSupPr>
+                        <m:ctrlPr>
+                          <w:rPr>
+                            <w:rFonts w:ascii="Cambria Math" w:hAnsi="Cambria Math"/>
+                            <w:i/>
+                          </w:rPr>
+                        </m:ctrlPr>
+                      </m:sSupPr>
+                      <m:e>
+                        <m:r>
+                          <w:rPr>
+                            <w:rFonts w:ascii="Cambria Math" w:hAnsi="Cambria Math"/>
+                          </w:rPr>
+                          <m:t>V</m:t>
+                        </m:r>
+                      </m:e>
+                      <m:sup>
+                        <m:r>
+                          <w:rPr>
+                            <w:rFonts w:ascii="Cambria Math" w:hAnsi="Cambria Math"/>
+                          </w:rPr>
+                          <m:t>2</m:t>
+                        </m:r>
+                      </m:sup>
+                    </m:sSup>
+                    <m:r>
+                      <w:rPr>
+                        <w:rFonts w:ascii="Cambria Math" w:hAnsi="Cambria Math"/>
+                      </w:rPr>
+                      <m:t>-</m:t>
+                    </m:r>
+                    <m:sSubSup>
+                      <m:sSubSupPr>
+                        <m:ctrlPr>
+                          <w:rPr>
+                            <w:rFonts w:ascii="Cambria Math" w:hAnsi="Cambria Math"/>
+                            <w:i/>
+                          </w:rPr>
+                        </m:ctrlPr>
+                      </m:sSubSupPr>
+                      <m:e>
+                        <m:r>
+                          <w:rPr>
+                            <w:rFonts w:ascii="Cambria Math" w:hAnsi="Cambria Math"/>
+                          </w:rPr>
+                          <m:t>V</m:t>
+                        </m:r>
+                      </m:e>
+                      <m:sub>
+                        <m:r>
+                          <w:rPr>
+                            <w:rFonts w:ascii="Cambria Math" w:hAnsi="Cambria Math"/>
+                          </w:rPr>
+                          <m:t>bl</m:t>
+                        </m:r>
+                      </m:sub>
+                      <m:sup>
+                        <m:r>
+                          <w:rPr>
+                            <w:rFonts w:ascii="Cambria Math" w:hAnsi="Cambria Math"/>
+                          </w:rPr>
+                          <m:t>2</m:t>
+                        </m:r>
+                      </m:sup>
+                    </m:sSubSup>
+                  </m:e>
+                </m:rad>
+              </m:oMath>
+            </m:oMathPara>
+          </w:p>
+        </w:tc>
+        <w:tc>
+          <w:tcPr>
+            <w:tcW w:w="3210" w:type="dxa"/>
+            <w:vAlign w:val="center"/>
+          </w:tcPr>
+          <w:p>
+            <w:pPr>
+              <w:jc w:val="right"/>
+            </w:pPr>
+            <w:r>
+              <w:t>(3.10)</w:t>
+            </w:r>
+          </w:p>
+        </w:tc>
+      </w:tr>
+    </w:tbl>
+    <w:p>
+      <w:r>
+        <w:t>Bilans jest prawdziwy tylko dla pocisków o ostrych nosach, dla bardziej tępych kształtów</w:t>
+      </w:r>
+      <w:r>
+        <w:t xml:space="preserve"> nosa</w:t>
+      </w:r>
+      <w:r>
+        <w:t xml:space="preserve"> należałoby uwzględnić</w:t>
+      </w:r>
+      <w:r>
+        <w:t xml:space="preserve"> w bilansie</w:t>
+      </w:r>
+      <w:r>
+        <w:t xml:space="preserve"> fragment celu który jest z niego wyrywany.</w:t>
+      </w:r>
+    </w:p>
+    <w:p>
+      <w:pPr>
+        <w:pStyle w:val="Heading3"/>
+      </w:pPr>
+      <w:r>
+        <w:t xml:space="preserve">Pocisk </w:t>
+      </w:r>
+      <w:r>
+        <w:t>ulega deformacji</w:t>
+      </w:r>
+    </w:p>
+    <w:p>
+      <w:pPr>
+        <w:keepNext w:val="0"/>
+      </w:pPr>
+      <w:r>
+        <w:t xml:space="preserve">Podobnie jak poprzednio należy obliczyć </w:t>
+      </w:r>
+      <w:proofErr w:type="spellStart"/>
+      <w:r>
         <w:t>R</w:t>
       </w:r>
       <w:r>
@@ -1810,58 +3107,780 @@
       </w:r>
       <w:proofErr w:type="spellEnd"/>
       <w:r>
-        <w:t xml:space="preserve"> pocisk zachowa się jak ciało sztywne.</w:t>
-      </w:r>
-      <w:r>
+        <w:rPr>
+          <w:vertAlign w:val="subscript"/>
+        </w:rPr>
         <w:t xml:space="preserve"> </w:t>
       </w:r>
       <w:r>
-        <w:t xml:space="preserve">Natomiast jeżeli </w:t>
+        <w:t>z użyciem tego samego wzoru.</w:t>
+      </w:r>
+      <w:r>
+        <w:t xml:space="preserve"> </w:t>
+      </w:r>
+      <w:r>
+        <w:t>Podczas zderzenia</w:t>
+      </w:r>
+      <w:r>
+        <w:t xml:space="preserve"> ciśnienie wywierane przez pocisk jest równe ciśnieniu wywieranemu przez cel można opisać to zmodyfikowanym równaniem </w:t>
       </w:r>
       <w:proofErr w:type="spellStart"/>
       <w:r>
-        <w:t>Y</w:t>
+        <w:t>B</w:t>
+      </w:r>
+      <w:r>
+        <w:t>ernoulliego</w:t>
+      </w:r>
+      <w:proofErr w:type="spellEnd"/>
+      <w:r>
+        <w:t>:</w:t>
+      </w:r>
+    </w:p>
+    <w:tbl>
+      <w:tblPr>
+        <w:tblStyle w:val="TableGrid"/>
+        <w:tblW w:w="0" w:type="auto"/>
+        <w:tblBorders>
+          <w:top w:val="none" w:sz="0" w:space="0" w:color="auto"/>
+          <w:left w:val="none" w:sz="0" w:space="0" w:color="auto"/>
+          <w:bottom w:val="none" w:sz="0" w:space="0" w:color="auto"/>
+          <w:right w:val="none" w:sz="0" w:space="0" w:color="auto"/>
+          <w:insideH w:val="none" w:sz="0" w:space="0" w:color="auto"/>
+          <w:insideV w:val="none" w:sz="0" w:space="0" w:color="auto"/>
+        </w:tblBorders>
+        <w:tblLook w:val="04A0" w:firstRow="1" w:lastRow="0" w:firstColumn="1" w:lastColumn="0" w:noHBand="0" w:noVBand="1"/>
+      </w:tblPr>
+      <w:tblGrid>
+        <w:gridCol w:w="2552"/>
+        <w:gridCol w:w="4394"/>
+        <w:gridCol w:w="2682"/>
+      </w:tblGrid>
+      <w:tr>
+        <w:tc>
+          <w:tcPr>
+            <w:tcW w:w="2552" w:type="dxa"/>
+          </w:tcPr>
+          <w:p>
+            <w:pPr>
+              <w:keepNext w:val="0"/>
+            </w:pPr>
+          </w:p>
+        </w:tc>
+        <w:tc>
+          <w:tcPr>
+            <w:tcW w:w="4394" w:type="dxa"/>
+          </w:tcPr>
+          <w:p>
+            <w:pPr>
+              <w:keepNext w:val="0"/>
+            </w:pPr>
+            <m:oMathPara>
+              <m:oMath>
+                <m:f>
+                  <m:fPr>
+                    <m:ctrlPr>
+                      <w:rPr>
+                        <w:rFonts w:ascii="Cambria Math" w:hAnsi="Cambria Math"/>
+                        <w:i/>
+                      </w:rPr>
+                    </m:ctrlPr>
+                  </m:fPr>
+                  <m:num>
+                    <m:sSub>
+                      <m:sSubPr>
+                        <m:ctrlPr>
+                          <w:rPr>
+                            <w:rFonts w:ascii="Cambria Math" w:hAnsi="Cambria Math"/>
+                            <w:i/>
+                          </w:rPr>
+                        </m:ctrlPr>
+                      </m:sSubPr>
+                      <m:e>
+                        <m:r>
+                          <w:rPr>
+                            <w:rFonts w:ascii="Cambria Math" w:hAnsi="Cambria Math"/>
+                          </w:rPr>
+                          <m:t>ρ</m:t>
+                        </m:r>
+                      </m:e>
+                      <m:sub>
+                        <m:r>
+                          <w:rPr>
+                            <w:rFonts w:ascii="Cambria Math" w:hAnsi="Cambria Math"/>
+                          </w:rPr>
+                          <m:t>p</m:t>
+                        </m:r>
+                      </m:sub>
+                    </m:sSub>
+                    <m:sSup>
+                      <m:sSupPr>
+                        <m:ctrlPr>
+                          <w:rPr>
+                            <w:rFonts w:ascii="Cambria Math" w:hAnsi="Cambria Math"/>
+                            <w:i/>
+                          </w:rPr>
+                        </m:ctrlPr>
+                      </m:sSupPr>
+                      <m:e>
+                        <m:d>
+                          <m:dPr>
+                            <m:ctrlPr>
+                              <w:rPr>
+                                <w:rFonts w:ascii="Cambria Math" w:hAnsi="Cambria Math"/>
+                                <w:i/>
+                              </w:rPr>
+                            </m:ctrlPr>
+                          </m:dPr>
+                          <m:e>
+                            <m:r>
+                              <w:rPr>
+                                <w:rFonts w:ascii="Cambria Math" w:hAnsi="Cambria Math"/>
+                              </w:rPr>
+                              <m:t>V-U</m:t>
+                            </m:r>
+                          </m:e>
+                        </m:d>
+                      </m:e>
+                      <m:sup>
+                        <m:r>
+                          <w:rPr>
+                            <w:rFonts w:ascii="Cambria Math" w:hAnsi="Cambria Math"/>
+                          </w:rPr>
+                          <m:t>2</m:t>
+                        </m:r>
+                      </m:sup>
+                    </m:sSup>
+                  </m:num>
+                  <m:den>
+                    <m:r>
+                      <w:rPr>
+                        <w:rFonts w:ascii="Cambria Math" w:hAnsi="Cambria Math"/>
+                      </w:rPr>
+                      <m:t>2</m:t>
+                    </m:r>
+                  </m:den>
+                </m:f>
+                <m:r>
+                  <w:rPr>
+                    <w:rFonts w:ascii="Cambria Math" w:hAnsi="Cambria Math"/>
+                  </w:rPr>
+                  <m:t>+</m:t>
+                </m:r>
+                <m:sSub>
+                  <m:sSubPr>
+                    <m:ctrlPr>
+                      <w:rPr>
+                        <w:rFonts w:ascii="Cambria Math" w:hAnsi="Cambria Math"/>
+                        <w:i/>
+                      </w:rPr>
+                    </m:ctrlPr>
+                  </m:sSubPr>
+                  <m:e>
+                    <m:r>
+                      <w:rPr>
+                        <w:rFonts w:ascii="Cambria Math" w:hAnsi="Cambria Math"/>
+                      </w:rPr>
+                      <m:t>Y</m:t>
+                    </m:r>
+                  </m:e>
+                  <m:sub>
+                    <m:r>
+                      <w:rPr>
+                        <w:rFonts w:ascii="Cambria Math" w:hAnsi="Cambria Math"/>
+                      </w:rPr>
+                      <m:t>p</m:t>
+                    </m:r>
+                  </m:sub>
+                </m:sSub>
+                <m:r>
+                  <w:rPr>
+                    <w:rFonts w:ascii="Cambria Math" w:hAnsi="Cambria Math"/>
+                  </w:rPr>
+                  <m:t>=</m:t>
+                </m:r>
+                <m:f>
+                  <m:fPr>
+                    <m:ctrlPr>
+                      <w:rPr>
+                        <w:rFonts w:ascii="Cambria Math" w:hAnsi="Cambria Math"/>
+                        <w:i/>
+                      </w:rPr>
+                    </m:ctrlPr>
+                  </m:fPr>
+                  <m:num>
+                    <m:sSub>
+                      <m:sSubPr>
+                        <m:ctrlPr>
+                          <w:rPr>
+                            <w:rFonts w:ascii="Cambria Math" w:hAnsi="Cambria Math"/>
+                            <w:i/>
+                          </w:rPr>
+                        </m:ctrlPr>
+                      </m:sSubPr>
+                      <m:e>
+                        <m:r>
+                          <w:rPr>
+                            <w:rFonts w:ascii="Cambria Math" w:hAnsi="Cambria Math"/>
+                          </w:rPr>
+                          <m:t>ρ</m:t>
+                        </m:r>
+                      </m:e>
+                      <m:sub>
+                        <m:r>
+                          <w:rPr>
+                            <w:rFonts w:ascii="Cambria Math" w:hAnsi="Cambria Math"/>
+                          </w:rPr>
+                          <m:t>t</m:t>
+                        </m:r>
+                      </m:sub>
+                    </m:sSub>
+                    <m:sSup>
+                      <m:sSupPr>
+                        <m:ctrlPr>
+                          <w:rPr>
+                            <w:rFonts w:ascii="Cambria Math" w:hAnsi="Cambria Math"/>
+                            <w:i/>
+                          </w:rPr>
+                        </m:ctrlPr>
+                      </m:sSupPr>
+                      <m:e>
+                        <m:r>
+                          <w:rPr>
+                            <w:rFonts w:ascii="Cambria Math" w:hAnsi="Cambria Math"/>
+                          </w:rPr>
+                          <m:t>U</m:t>
+                        </m:r>
+                      </m:e>
+                      <m:sup>
+                        <m:r>
+                          <w:rPr>
+                            <w:rFonts w:ascii="Cambria Math" w:hAnsi="Cambria Math"/>
+                          </w:rPr>
+                          <m:t>2</m:t>
+                        </m:r>
+                      </m:sup>
+                    </m:sSup>
+                  </m:num>
+                  <m:den>
+                    <m:r>
+                      <w:rPr>
+                        <w:rFonts w:ascii="Cambria Math" w:hAnsi="Cambria Math"/>
+                      </w:rPr>
+                      <m:t>2</m:t>
+                    </m:r>
+                  </m:den>
+                </m:f>
+                <m:r>
+                  <w:rPr>
+                    <w:rFonts w:ascii="Cambria Math" w:hAnsi="Cambria Math"/>
+                  </w:rPr>
+                  <m:t>+</m:t>
+                </m:r>
+                <m:sSub>
+                  <m:sSubPr>
+                    <m:ctrlPr>
+                      <w:rPr>
+                        <w:rFonts w:ascii="Cambria Math" w:hAnsi="Cambria Math"/>
+                        <w:i/>
+                      </w:rPr>
+                    </m:ctrlPr>
+                  </m:sSubPr>
+                  <m:e>
+                    <m:r>
+                      <w:rPr>
+                        <w:rFonts w:ascii="Cambria Math" w:hAnsi="Cambria Math"/>
+                      </w:rPr>
+                      <m:t>R</m:t>
+                    </m:r>
+                  </m:e>
+                  <m:sub>
+                    <m:r>
+                      <w:rPr>
+                        <w:rFonts w:ascii="Cambria Math" w:hAnsi="Cambria Math"/>
+                      </w:rPr>
+                      <m:t>t</m:t>
+                    </m:r>
+                  </m:sub>
+                </m:sSub>
+              </m:oMath>
+            </m:oMathPara>
+          </w:p>
+        </w:tc>
+        <w:tc>
+          <w:tcPr>
+            <w:tcW w:w="2682" w:type="dxa"/>
+            <w:vAlign w:val="center"/>
+          </w:tcPr>
+          <w:p>
+            <w:pPr>
+              <w:keepNext w:val="0"/>
+              <w:jc w:val="right"/>
+            </w:pPr>
+            <w:r>
+              <w:t>(3.1</w:t>
+            </w:r>
+            <w:r>
+              <w:t>1</w:t>
+            </w:r>
+            <w:r>
+              <w:t>)</w:t>
+            </w:r>
+          </w:p>
+        </w:tc>
+      </w:tr>
+    </w:tbl>
+    <w:p>
+      <w:pPr>
+        <w:keepNext w:val="0"/>
+      </w:pPr>
+      <w:r>
+        <w:t>Podczas zderzenia pocisku z celem w wyniku deformacji przód pocisku ma inną prędkość niż tył. Prędkość tą określa się mianem prędkości wnikania (U)</w:t>
+      </w:r>
+      <w:r>
+        <w:t>, jej wyprowadzenie z powyższego wzoru to</w:t>
+      </w:r>
+      <w:r>
+        <w:t>:</w:t>
+      </w:r>
+    </w:p>
+    <w:tbl>
+      <w:tblPr>
+        <w:tblStyle w:val="TableGrid"/>
+        <w:tblW w:w="9781" w:type="dxa"/>
+        <w:tblBorders>
+          <w:top w:val="none" w:sz="0" w:space="0" w:color="auto"/>
+          <w:left w:val="none" w:sz="0" w:space="0" w:color="auto"/>
+          <w:bottom w:val="none" w:sz="0" w:space="0" w:color="auto"/>
+          <w:right w:val="none" w:sz="0" w:space="0" w:color="auto"/>
+          <w:insideH w:val="none" w:sz="0" w:space="0" w:color="auto"/>
+          <w:insideV w:val="none" w:sz="0" w:space="0" w:color="auto"/>
+        </w:tblBorders>
+        <w:tblLook w:val="04A0" w:firstRow="1" w:lastRow="0" w:firstColumn="1" w:lastColumn="0" w:noHBand="0" w:noVBand="1"/>
+      </w:tblPr>
+      <w:tblGrid>
+        <w:gridCol w:w="3205"/>
+        <w:gridCol w:w="3366"/>
+        <w:gridCol w:w="3210"/>
+      </w:tblGrid>
+      <w:tr>
+        <w:tc>
+          <w:tcPr>
+            <w:tcW w:w="3205" w:type="dxa"/>
+          </w:tcPr>
+          <w:p/>
+        </w:tc>
+        <w:tc>
+          <w:tcPr>
+            <w:tcW w:w="3366" w:type="dxa"/>
+          </w:tcPr>
+          <w:p>
+            <m:oMathPara>
+              <m:oMath>
+                <m:r>
+                  <w:rPr>
+                    <w:rFonts w:ascii="Cambria Math" w:hAnsi="Cambria Math"/>
+                  </w:rPr>
+                  <m:t>U=</m:t>
+                </m:r>
+                <m:f>
+                  <m:fPr>
+                    <m:ctrlPr>
+                      <w:rPr>
+                        <w:rFonts w:ascii="Cambria Math" w:hAnsi="Cambria Math"/>
+                        <w:i/>
+                      </w:rPr>
+                    </m:ctrlPr>
+                  </m:fPr>
+                  <m:num>
+                    <m:r>
+                      <w:rPr>
+                        <w:rFonts w:ascii="Cambria Math" w:hAnsi="Cambria Math"/>
+                      </w:rPr>
+                      <m:t>V-</m:t>
+                    </m:r>
+                    <m:rad>
+                      <m:radPr>
+                        <m:degHide m:val="1"/>
+                        <m:ctrlPr>
+                          <w:rPr>
+                            <w:rFonts w:ascii="Cambria Math" w:hAnsi="Cambria Math"/>
+                            <w:i/>
+                          </w:rPr>
+                        </m:ctrlPr>
+                      </m:radPr>
+                      <m:deg/>
+                      <m:e>
+                        <m:sSup>
+                          <m:sSupPr>
+                            <m:ctrlPr>
+                              <w:rPr>
+                                <w:rFonts w:ascii="Cambria Math" w:hAnsi="Cambria Math"/>
+                                <w:i/>
+                              </w:rPr>
+                            </m:ctrlPr>
+                          </m:sSupPr>
+                          <m:e>
+                            <m:r>
+                              <w:rPr>
+                                <w:rFonts w:ascii="Cambria Math" w:hAnsi="Cambria Math"/>
+                              </w:rPr>
+                              <m:t>µ</m:t>
+                            </m:r>
+                          </m:e>
+                          <m:sup>
+                            <m:r>
+                              <w:rPr>
+                                <w:rFonts w:ascii="Cambria Math" w:hAnsi="Cambria Math"/>
+                              </w:rPr>
+                              <m:t>2</m:t>
+                            </m:r>
+                          </m:sup>
+                        </m:sSup>
+                        <m:sSup>
+                          <m:sSupPr>
+                            <m:ctrlPr>
+                              <w:rPr>
+                                <w:rFonts w:ascii="Cambria Math" w:hAnsi="Cambria Math"/>
+                                <w:i/>
+                              </w:rPr>
+                            </m:ctrlPr>
+                          </m:sSupPr>
+                          <m:e>
+                            <m:r>
+                              <w:rPr>
+                                <w:rFonts w:ascii="Cambria Math" w:hAnsi="Cambria Math"/>
+                              </w:rPr>
+                              <m:t>V</m:t>
+                            </m:r>
+                          </m:e>
+                          <m:sup>
+                            <m:r>
+                              <w:rPr>
+                                <w:rFonts w:ascii="Cambria Math" w:hAnsi="Cambria Math"/>
+                              </w:rPr>
+                              <m:t>2</m:t>
+                            </m:r>
+                          </m:sup>
+                        </m:sSup>
+                        <m:r>
+                          <w:rPr>
+                            <w:rFonts w:ascii="Cambria Math" w:hAnsi="Cambria Math"/>
+                          </w:rPr>
+                          <m:t>+</m:t>
+                        </m:r>
+                        <m:d>
+                          <m:dPr>
+                            <m:ctrlPr>
+                              <w:rPr>
+                                <w:rFonts w:ascii="Cambria Math" w:hAnsi="Cambria Math"/>
+                                <w:i/>
+                              </w:rPr>
+                            </m:ctrlPr>
+                          </m:dPr>
+                          <m:e>
+                            <m:r>
+                              <w:rPr>
+                                <w:rFonts w:ascii="Cambria Math" w:hAnsi="Cambria Math"/>
+                              </w:rPr>
+                              <m:t>1-</m:t>
+                            </m:r>
+                            <m:sSup>
+                              <m:sSupPr>
+                                <m:ctrlPr>
+                                  <w:rPr>
+                                    <w:rFonts w:ascii="Cambria Math" w:hAnsi="Cambria Math"/>
+                                    <w:i/>
+                                  </w:rPr>
+                                </m:ctrlPr>
+                              </m:sSupPr>
+                              <m:e>
+                                <m:r>
+                                  <w:rPr>
+                                    <w:rFonts w:ascii="Cambria Math" w:hAnsi="Cambria Math"/>
+                                  </w:rPr>
+                                  <m:t>µ</m:t>
+                                </m:r>
+                              </m:e>
+                              <m:sup>
+                                <m:r>
+                                  <w:rPr>
+                                    <w:rFonts w:ascii="Cambria Math" w:hAnsi="Cambria Math"/>
+                                  </w:rPr>
+                                  <m:t>2</m:t>
+                                </m:r>
+                              </m:sup>
+                            </m:sSup>
+                          </m:e>
+                        </m:d>
+                        <m:sSubSup>
+                          <m:sSubSupPr>
+                            <m:ctrlPr>
+                              <w:rPr>
+                                <w:rFonts w:ascii="Cambria Math" w:hAnsi="Cambria Math"/>
+                                <w:i/>
+                              </w:rPr>
+                            </m:ctrlPr>
+                          </m:sSubSupPr>
+                          <m:e>
+                            <m:r>
+                              <w:rPr>
+                                <w:rFonts w:ascii="Cambria Math" w:hAnsi="Cambria Math"/>
+                              </w:rPr>
+                              <m:t>V</m:t>
+                            </m:r>
+                          </m:e>
+                          <m:sub>
+                            <m:r>
+                              <w:rPr>
+                                <w:rFonts w:ascii="Cambria Math" w:hAnsi="Cambria Math"/>
+                              </w:rPr>
+                              <m:t>c</m:t>
+                            </m:r>
+                          </m:sub>
+                          <m:sup>
+                            <m:r>
+                              <w:rPr>
+                                <w:rFonts w:ascii="Cambria Math" w:hAnsi="Cambria Math"/>
+                              </w:rPr>
+                              <m:t>2</m:t>
+                            </m:r>
+                          </m:sup>
+                        </m:sSubSup>
+                      </m:e>
+                    </m:rad>
+                  </m:num>
+                  <m:den>
+                    <m:r>
+                      <w:rPr>
+                        <w:rFonts w:ascii="Cambria Math" w:hAnsi="Cambria Math"/>
+                      </w:rPr>
+                      <m:t>1-</m:t>
+                    </m:r>
+                    <m:sSup>
+                      <m:sSupPr>
+                        <m:ctrlPr>
+                          <w:rPr>
+                            <w:rFonts w:ascii="Cambria Math" w:hAnsi="Cambria Math"/>
+                            <w:i/>
+                          </w:rPr>
+                        </m:ctrlPr>
+                      </m:sSupPr>
+                      <m:e>
+                        <m:r>
+                          <w:rPr>
+                            <w:rFonts w:ascii="Cambria Math" w:hAnsi="Cambria Math"/>
+                          </w:rPr>
+                          <m:t>µ</m:t>
+                        </m:r>
+                      </m:e>
+                      <m:sup>
+                        <m:r>
+                          <w:rPr>
+                            <w:rFonts w:ascii="Cambria Math" w:hAnsi="Cambria Math"/>
+                          </w:rPr>
+                          <m:t>2</m:t>
+                        </m:r>
+                      </m:sup>
+                    </m:sSup>
+                  </m:den>
+                </m:f>
+              </m:oMath>
+            </m:oMathPara>
+          </w:p>
+        </w:tc>
+        <w:tc>
+          <w:tcPr>
+            <w:tcW w:w="3210" w:type="dxa"/>
+            <w:vAlign w:val="center"/>
+          </w:tcPr>
+          <w:p>
+            <w:pPr>
+              <w:jc w:val="right"/>
+            </w:pPr>
+            <w:r>
+              <w:t>(3.</w:t>
+            </w:r>
+            <w:r>
+              <w:t>1</w:t>
+            </w:r>
+            <w:r>
+              <w:t>2</w:t>
+            </w:r>
+            <w:r>
+              <w:t>)</w:t>
+            </w:r>
+          </w:p>
+        </w:tc>
+      </w:tr>
+    </w:tbl>
+    <w:p>
+      <w:r>
+        <w:t>Gdzie</w:t>
+      </w:r>
+      <w:r>
+        <w:t xml:space="preserve"> </w:t>
+      </w:r>
+      <m:oMath>
+        <m:r>
+          <w:rPr>
+            <w:rFonts w:ascii="Cambria Math" w:hAnsi="Cambria Math"/>
+          </w:rPr>
+          <m:t>µ=</m:t>
+        </m:r>
+        <m:rad>
+          <m:radPr>
+            <m:degHide m:val="1"/>
+            <m:ctrlPr>
+              <w:rPr>
+                <w:rFonts w:ascii="Cambria Math" w:hAnsi="Cambria Math"/>
+                <w:i/>
+              </w:rPr>
+            </m:ctrlPr>
+          </m:radPr>
+          <m:deg/>
+          <m:e>
+            <m:f>
+              <m:fPr>
+                <m:ctrlPr>
+                  <w:rPr>
+                    <w:rFonts w:ascii="Cambria Math" w:hAnsi="Cambria Math"/>
+                    <w:i/>
+                  </w:rPr>
+                </m:ctrlPr>
+              </m:fPr>
+              <m:num>
+                <m:sSub>
+                  <m:sSubPr>
+                    <m:ctrlPr>
+                      <w:rPr>
+                        <w:rFonts w:ascii="Cambria Math" w:hAnsi="Cambria Math"/>
+                        <w:i/>
+                      </w:rPr>
+                    </m:ctrlPr>
+                  </m:sSubPr>
+                  <m:e>
+                    <m:r>
+                      <w:rPr>
+                        <w:rFonts w:ascii="Cambria Math" w:hAnsi="Cambria Math"/>
+                      </w:rPr>
+                      <m:t>ρ</m:t>
+                    </m:r>
+                  </m:e>
+                  <m:sub>
+                    <m:r>
+                      <w:rPr>
+                        <w:rFonts w:ascii="Cambria Math" w:hAnsi="Cambria Math"/>
+                      </w:rPr>
+                      <m:t>t</m:t>
+                    </m:r>
+                  </m:sub>
+                </m:sSub>
+              </m:num>
+              <m:den>
+                <m:sSub>
+                  <m:sSubPr>
+                    <m:ctrlPr>
+                      <w:rPr>
+                        <w:rFonts w:ascii="Cambria Math" w:hAnsi="Cambria Math"/>
+                        <w:i/>
+                      </w:rPr>
+                    </m:ctrlPr>
+                  </m:sSubPr>
+                  <m:e>
+                    <m:r>
+                      <w:rPr>
+                        <w:rFonts w:ascii="Cambria Math" w:hAnsi="Cambria Math"/>
+                      </w:rPr>
+                      <m:t>ρ</m:t>
+                    </m:r>
+                  </m:e>
+                  <m:sub>
+                    <m:r>
+                      <w:rPr>
+                        <w:rFonts w:ascii="Cambria Math" w:hAnsi="Cambria Math"/>
+                      </w:rPr>
+                      <m:t>p</m:t>
+                    </m:r>
+                  </m:sub>
+                </m:sSub>
+              </m:den>
+            </m:f>
+          </m:e>
+        </m:rad>
+      </m:oMath>
+      <w:r>
+        <w:t xml:space="preserve"> </w:t>
+      </w:r>
+      <w:r>
+        <w:t>to</w:t>
+      </w:r>
+      <w:r>
+        <w:t xml:space="preserve"> </w:t>
+      </w:r>
+      <w:r>
+        <w:t>pierw</w:t>
+      </w:r>
+      <w:r>
+        <w:t>iastek stosunku gęstości celu (</w:t>
+      </w:r>
+      <w:proofErr w:type="spellStart"/>
+      <w:r>
+        <w:t>ρ</w:t>
       </w:r>
       <w:r>
         <w:rPr>
           <w:vertAlign w:val="subscript"/>
         </w:rPr>
+        <w:t>t</w:t>
+      </w:r>
+      <w:proofErr w:type="spellEnd"/>
+      <w:r>
+        <w:t>) i pocisku (</w:t>
+      </w:r>
+      <w:proofErr w:type="spellStart"/>
+      <w:r>
+        <w:t>ρ</w:t>
+      </w:r>
+      <w:r>
+        <w:rPr>
+          <w:vertAlign w:val="subscript"/>
+        </w:rPr>
         <w:t>p</w:t>
       </w:r>
       <w:proofErr w:type="spellEnd"/>
       <w:r>
-        <w:t xml:space="preserve"> </w:t>
-      </w:r>
-      <w:r>
-        <w:lastRenderedPageBreak/>
-        <w:t>jest mniejsz</w:t>
-      </w:r>
-      <w:r>
-        <w:t>e</w:t>
-      </w:r>
-      <w:r>
-        <w:t>, pocisk zaczyna się odkształcać</w:t>
+        <w:t>)</w:t>
       </w:r>
       <w:r>
         <w:t>.</w:t>
       </w:r>
-      <w:r>
-        <w:t xml:space="preserve"> </w:t>
-      </w:r>
-      <w:r>
-        <w:t xml:space="preserve">Może on spenetrować cel tylko </w:t>
-      </w:r>
-      <w:r>
-        <w:t>wtedy,</w:t>
-      </w:r>
-      <w:r>
-        <w:t xml:space="preserve"> </w:t>
-      </w:r>
-      <w:r>
-        <w:t>gdy</w:t>
-      </w:r>
-      <w:r>
-        <w:t xml:space="preserve"> osiągnie prędkość większą od prędkości krytycznej:</w:t>
+    </w:p>
+    <w:p>
+      <w:pPr>
+        <w:keepNext w:val="0"/>
+      </w:pPr>
+      <w:r>
+        <w:t>Penetracja jest możliwa tylko wtedy, gdy U &gt; 0, dlatego z równania</w:t>
+      </w:r>
+      <w:r>
+        <w:t xml:space="preserve"> 3.11</w:t>
+      </w:r>
+      <w:r>
+        <w:t xml:space="preserve"> można wyprowadzić minimalną prędkość (</w:t>
+      </w:r>
+      <w:proofErr w:type="spellStart"/>
+      <w:r>
+        <w:t>V</w:t>
+      </w:r>
+      <w:r>
+        <w:rPr>
+          <w:vertAlign w:val="subscript"/>
+        </w:rPr>
+        <w:t>c</w:t>
+      </w:r>
+      <w:proofErr w:type="spellEnd"/>
+      <w:r>
+        <w:t>) potrzebną do spenetrowania celu:</w:t>
       </w:r>
     </w:p>
     <w:tbl>
@@ -2073,297 +4092,10 @@
               <w:jc w:val="right"/>
             </w:pPr>
             <w:r>
-              <w:t>(3.5)</w:t>
-            </w:r>
-          </w:p>
-        </w:tc>
-      </w:tr>
-    </w:tbl>
-    <w:p>
-      <w:r>
-        <w:t>W</w:t>
-      </w:r>
-      <w:r>
-        <w:t xml:space="preserve"> trakcie</w:t>
-      </w:r>
-      <w:r>
-        <w:t xml:space="preserve"> penetracji</w:t>
-      </w:r>
-      <w:r>
-        <w:t xml:space="preserve"> czoło pocisku </w:t>
-      </w:r>
-      <w:r>
-        <w:t xml:space="preserve">jest hamowane przez cel, a skoro pocisk nie zachowuje się jak ciało sztywne to jego przód i tył mają różne prędkości. </w:t>
-      </w:r>
-      <w:r>
-        <w:t>Tylna część ma prędkość pocisku w momencie zderzenia, natomiast p</w:t>
-      </w:r>
-      <w:r>
-        <w:t>rędkość przedniej części można opisać za pomocą wzoru:</w:t>
-      </w:r>
-    </w:p>
-    <w:tbl>
-      <w:tblPr>
-        <w:tblStyle w:val="TableGrid"/>
-        <w:tblW w:w="9781" w:type="dxa"/>
-        <w:tblBorders>
-          <w:top w:val="none" w:sz="0" w:space="0" w:color="auto"/>
-          <w:left w:val="none" w:sz="0" w:space="0" w:color="auto"/>
-          <w:bottom w:val="none" w:sz="0" w:space="0" w:color="auto"/>
-          <w:right w:val="none" w:sz="0" w:space="0" w:color="auto"/>
-          <w:insideH w:val="none" w:sz="0" w:space="0" w:color="auto"/>
-          <w:insideV w:val="none" w:sz="0" w:space="0" w:color="auto"/>
-        </w:tblBorders>
-        <w:tblLook w:val="04A0" w:firstRow="1" w:lastRow="0" w:firstColumn="1" w:lastColumn="0" w:noHBand="0" w:noVBand="1"/>
-      </w:tblPr>
-      <w:tblGrid>
-        <w:gridCol w:w="3205"/>
-        <w:gridCol w:w="3366"/>
-        <w:gridCol w:w="3210"/>
-      </w:tblGrid>
-      <w:tr>
-        <w:tc>
-          <w:tcPr>
-            <w:tcW w:w="3205" w:type="dxa"/>
-          </w:tcPr>
-          <w:p/>
-        </w:tc>
-        <w:tc>
-          <w:tcPr>
-            <w:tcW w:w="3366" w:type="dxa"/>
-          </w:tcPr>
-          <w:p>
-            <m:oMathPara>
-              <m:oMath>
-                <m:r>
-                  <w:rPr>
-                    <w:rFonts w:ascii="Cambria Math" w:hAnsi="Cambria Math"/>
-                  </w:rPr>
-                  <m:t>U=</m:t>
-                </m:r>
-                <m:f>
-                  <m:fPr>
-                    <m:ctrlPr>
-                      <w:rPr>
-                        <w:rFonts w:ascii="Cambria Math" w:hAnsi="Cambria Math"/>
-                        <w:i/>
-                      </w:rPr>
-                    </m:ctrlPr>
-                  </m:fPr>
-                  <m:num>
-                    <m:r>
-                      <w:rPr>
-                        <w:rFonts w:ascii="Cambria Math" w:hAnsi="Cambria Math"/>
-                      </w:rPr>
-                      <m:t>V-</m:t>
-                    </m:r>
-                    <m:rad>
-                      <m:radPr>
-                        <m:degHide m:val="1"/>
-                        <m:ctrlPr>
-                          <w:rPr>
-                            <w:rFonts w:ascii="Cambria Math" w:hAnsi="Cambria Math"/>
-                            <w:i/>
-                          </w:rPr>
-                        </m:ctrlPr>
-                      </m:radPr>
-                      <m:deg/>
-                      <m:e>
-                        <m:sSup>
-                          <m:sSupPr>
-                            <m:ctrlPr>
-                              <w:rPr>
-                                <w:rFonts w:ascii="Cambria Math" w:hAnsi="Cambria Math"/>
-                                <w:i/>
-                              </w:rPr>
-                            </m:ctrlPr>
-                          </m:sSupPr>
-                          <m:e>
-                            <m:r>
-                              <w:rPr>
-                                <w:rFonts w:ascii="Cambria Math" w:hAnsi="Cambria Math"/>
-                              </w:rPr>
-                              <m:t>µ</m:t>
-                            </m:r>
-                          </m:e>
-                          <m:sup>
-                            <m:r>
-                              <w:rPr>
-                                <w:rFonts w:ascii="Cambria Math" w:hAnsi="Cambria Math"/>
-                              </w:rPr>
-                              <m:t>2</m:t>
-                            </m:r>
-                          </m:sup>
-                        </m:sSup>
-                        <m:sSup>
-                          <m:sSupPr>
-                            <m:ctrlPr>
-                              <w:rPr>
-                                <w:rFonts w:ascii="Cambria Math" w:hAnsi="Cambria Math"/>
-                                <w:i/>
-                              </w:rPr>
-                            </m:ctrlPr>
-                          </m:sSupPr>
-                          <m:e>
-                            <m:r>
-                              <w:rPr>
-                                <w:rFonts w:ascii="Cambria Math" w:hAnsi="Cambria Math"/>
-                              </w:rPr>
-                              <m:t>V</m:t>
-                            </m:r>
-                          </m:e>
-                          <m:sup>
-                            <m:r>
-                              <w:rPr>
-                                <w:rFonts w:ascii="Cambria Math" w:hAnsi="Cambria Math"/>
-                              </w:rPr>
-                              <m:t>2</m:t>
-                            </m:r>
-                          </m:sup>
-                        </m:sSup>
-                        <m:r>
-                          <w:rPr>
-                            <w:rFonts w:ascii="Cambria Math" w:hAnsi="Cambria Math"/>
-                          </w:rPr>
-                          <m:t>+</m:t>
-                        </m:r>
-                        <m:d>
-                          <m:dPr>
-                            <m:ctrlPr>
-                              <w:rPr>
-                                <w:rFonts w:ascii="Cambria Math" w:hAnsi="Cambria Math"/>
-                                <w:i/>
-                              </w:rPr>
-                            </m:ctrlPr>
-                          </m:dPr>
-                          <m:e>
-                            <m:r>
-                              <w:rPr>
-                                <w:rFonts w:ascii="Cambria Math" w:hAnsi="Cambria Math"/>
-                              </w:rPr>
-                              <m:t>1-</m:t>
-                            </m:r>
-                            <m:sSup>
-                              <m:sSupPr>
-                                <m:ctrlPr>
-                                  <w:rPr>
-                                    <w:rFonts w:ascii="Cambria Math" w:hAnsi="Cambria Math"/>
-                                    <w:i/>
-                                  </w:rPr>
-                                </m:ctrlPr>
-                              </m:sSupPr>
-                              <m:e>
-                                <m:r>
-                                  <w:rPr>
-                                    <w:rFonts w:ascii="Cambria Math" w:hAnsi="Cambria Math"/>
-                                  </w:rPr>
-                                  <m:t>µ</m:t>
-                                </m:r>
-                              </m:e>
-                              <m:sup>
-                                <m:r>
-                                  <w:rPr>
-                                    <w:rFonts w:ascii="Cambria Math" w:hAnsi="Cambria Math"/>
-                                  </w:rPr>
-                                  <m:t>2</m:t>
-                                </m:r>
-                              </m:sup>
-                            </m:sSup>
-                          </m:e>
-                        </m:d>
-                        <m:sSubSup>
-                          <m:sSubSupPr>
-                            <m:ctrlPr>
-                              <w:rPr>
-                                <w:rFonts w:ascii="Cambria Math" w:hAnsi="Cambria Math"/>
-                                <w:i/>
-                              </w:rPr>
-                            </m:ctrlPr>
-                          </m:sSubSupPr>
-                          <m:e>
-                            <m:r>
-                              <w:rPr>
-                                <w:rFonts w:ascii="Cambria Math" w:hAnsi="Cambria Math"/>
-                              </w:rPr>
-                              <m:t>V</m:t>
-                            </m:r>
-                          </m:e>
-                          <m:sub>
-                            <m:r>
-                              <w:rPr>
-                                <w:rFonts w:ascii="Cambria Math" w:hAnsi="Cambria Math"/>
-                              </w:rPr>
-                              <m:t>c</m:t>
-                            </m:r>
-                          </m:sub>
-                          <m:sup>
-                            <m:r>
-                              <w:rPr>
-                                <w:rFonts w:ascii="Cambria Math" w:hAnsi="Cambria Math"/>
-                              </w:rPr>
-                              <m:t>2</m:t>
-                            </m:r>
-                          </m:sup>
-                        </m:sSubSup>
-                      </m:e>
-                    </m:rad>
-                  </m:num>
-                  <m:den>
-                    <m:r>
-                      <w:rPr>
-                        <w:rFonts w:ascii="Cambria Math" w:hAnsi="Cambria Math"/>
-                      </w:rPr>
-                      <m:t>1-</m:t>
-                    </m:r>
-                    <m:sSup>
-                      <m:sSupPr>
-                        <m:ctrlPr>
-                          <w:rPr>
-                            <w:rFonts w:ascii="Cambria Math" w:hAnsi="Cambria Math"/>
-                            <w:i/>
-                          </w:rPr>
-                        </m:ctrlPr>
-                      </m:sSupPr>
-                      <m:e>
-                        <m:r>
-                          <w:rPr>
-                            <w:rFonts w:ascii="Cambria Math" w:hAnsi="Cambria Math"/>
-                          </w:rPr>
-                          <m:t>µ</m:t>
-                        </m:r>
-                      </m:e>
-                      <m:sup>
-                        <m:r>
-                          <w:rPr>
-                            <w:rFonts w:ascii="Cambria Math" w:hAnsi="Cambria Math"/>
-                          </w:rPr>
-                          <m:t>2</m:t>
-                        </m:r>
-                      </m:sup>
-                    </m:sSup>
-                  </m:den>
-                </m:f>
-              </m:oMath>
-            </m:oMathPara>
-          </w:p>
-        </w:tc>
-        <w:tc>
-          <w:tcPr>
-            <w:tcW w:w="3210" w:type="dxa"/>
-            <w:vAlign w:val="center"/>
-          </w:tcPr>
-          <w:p>
-            <w:pPr>
-              <w:jc w:val="right"/>
-            </w:pPr>
-            <w:r>
-              <w:t>(</w:t>
+              <w:t>(3.1</w:t>
             </w:r>
             <w:r>
-              <w:t>3.</w:t>
-            </w:r>
-            <w:r>
-              <w:t>6</w:t>
+              <w:t>3</w:t>
             </w:r>
             <w:r>
               <w:t>)</w:t>
@@ -2373,8 +4105,32 @@
       </w:tr>
     </w:tbl>
     <w:p>
-      <w:r>
-        <w:t>Gdzie współczynnik µ jest opisany wzorem:</w:t>
+      <w:pPr>
+        <w:keepNext w:val="0"/>
+      </w:pPr>
+      <w:r>
+        <w:t xml:space="preserve">Mając U, można obliczyć warunek </w:t>
+      </w:r>
+      <w:r>
+        <w:t>rykoszetu,</w:t>
+      </w:r>
+      <w:r>
+        <w:t xml:space="preserve"> który ma podobną postać co poprzednio</w:t>
+      </w:r>
+      <w:r>
+        <w:t>,</w:t>
+      </w:r>
+      <w:r>
+        <w:t xml:space="preserve"> ale</w:t>
+      </w:r>
+      <w:r>
+        <w:t xml:space="preserve"> teraz uwzględnia on</w:t>
+      </w:r>
+      <w:r>
+        <w:t xml:space="preserve"> również</w:t>
+      </w:r>
+      <w:r>
+        <w:t xml:space="preserve"> prędkość wnikania:</w:t>
       </w:r>
     </w:p>
     <w:tbl>
@@ -2410,23 +4166,172 @@
           <w:p>
             <m:oMathPara>
               <m:oMath>
+                <m:func>
+                  <m:funcPr>
+                    <m:ctrlPr>
+                      <w:rPr>
+                        <w:rFonts w:ascii="Cambria Math" w:hAnsi="Cambria Math"/>
+                        <w:i/>
+                      </w:rPr>
+                    </m:ctrlPr>
+                  </m:funcPr>
+                  <m:fName>
+                    <m:sSup>
+                      <m:sSupPr>
+                        <m:ctrlPr>
+                          <w:rPr>
+                            <w:rFonts w:ascii="Cambria Math" w:hAnsi="Cambria Math"/>
+                            <w:i/>
+                          </w:rPr>
+                        </m:ctrlPr>
+                      </m:sSupPr>
+                      <m:e>
+                        <m:r>
+                          <m:rPr>
+                            <m:sty m:val="p"/>
+                          </m:rPr>
+                          <w:rPr>
+                            <w:rFonts w:ascii="Cambria Math" w:hAnsi="Cambria Math"/>
+                          </w:rPr>
+                          <m:t>tan</m:t>
+                        </m:r>
+                        <m:ctrlPr>
+                          <w:rPr>
+                            <w:rFonts w:ascii="Cambria Math" w:hAnsi="Cambria Math"/>
+                          </w:rPr>
+                        </m:ctrlPr>
+                      </m:e>
+                      <m:sup>
+                        <m:r>
+                          <w:rPr>
+                            <w:rFonts w:ascii="Cambria Math" w:hAnsi="Cambria Math"/>
+                          </w:rPr>
+                          <m:t>2</m:t>
+                        </m:r>
+                        <m:ctrlPr>
+                          <w:rPr>
+                            <w:rFonts w:ascii="Cambria Math" w:hAnsi="Cambria Math"/>
+                          </w:rPr>
+                        </m:ctrlPr>
+                      </m:sup>
+                    </m:sSup>
+                  </m:fName>
+                  <m:e>
+                    <m:r>
+                      <w:rPr>
+                        <w:rFonts w:ascii="Cambria Math" w:hAnsi="Cambria Math"/>
+                      </w:rPr>
+                      <m:t>β</m:t>
+                    </m:r>
+                  </m:e>
+                </m:func>
                 <m:r>
                   <w:rPr>
                     <w:rFonts w:ascii="Cambria Math" w:hAnsi="Cambria Math"/>
                   </w:rPr>
-                  <m:t>µ=</m:t>
+                  <m:t>&gt;</m:t>
                 </m:r>
-                <m:rad>
-                  <m:radPr>
-                    <m:degHide m:val="1"/>
+                <m:f>
+                  <m:fPr>
                     <m:ctrlPr>
                       <w:rPr>
                         <w:rFonts w:ascii="Cambria Math" w:hAnsi="Cambria Math"/>
                         <w:i/>
                       </w:rPr>
                     </m:ctrlPr>
-                  </m:radPr>
-                  <m:deg/>
+                  </m:fPr>
+                  <m:num>
+                    <m:sSub>
+                      <m:sSubPr>
+                        <m:ctrlPr>
+                          <w:rPr>
+                            <w:rFonts w:ascii="Cambria Math" w:hAnsi="Cambria Math"/>
+                            <w:i/>
+                          </w:rPr>
+                        </m:ctrlPr>
+                      </m:sSubPr>
+                      <m:e>
+                        <m:r>
+                          <w:rPr>
+                            <w:rFonts w:ascii="Cambria Math" w:hAnsi="Cambria Math"/>
+                          </w:rPr>
+                          <m:t>ρ</m:t>
+                        </m:r>
+                      </m:e>
+                      <m:sub>
+                        <m:r>
+                          <w:rPr>
+                            <w:rFonts w:ascii="Cambria Math" w:hAnsi="Cambria Math"/>
+                          </w:rPr>
+                          <m:t>p</m:t>
+                        </m:r>
+                      </m:sub>
+                    </m:sSub>
+                    <m:sSup>
+                      <m:sSupPr>
+                        <m:ctrlPr>
+                          <w:rPr>
+                            <w:rFonts w:ascii="Cambria Math" w:hAnsi="Cambria Math"/>
+                            <w:i/>
+                          </w:rPr>
+                        </m:ctrlPr>
+                      </m:sSupPr>
+                      <m:e>
+                        <m:r>
+                          <w:rPr>
+                            <w:rFonts w:ascii="Cambria Math" w:hAnsi="Cambria Math"/>
+                          </w:rPr>
+                          <m:t>V</m:t>
+                        </m:r>
+                      </m:e>
+                      <m:sup>
+                        <m:r>
+                          <w:rPr>
+                            <w:rFonts w:ascii="Cambria Math" w:hAnsi="Cambria Math"/>
+                          </w:rPr>
+                          <m:t>2</m:t>
+                        </m:r>
+                      </m:sup>
+                    </m:sSup>
+                  </m:num>
+                  <m:den>
+                    <m:sSub>
+                      <m:sSubPr>
+                        <m:ctrlPr>
+                          <w:rPr>
+                            <w:rFonts w:ascii="Cambria Math" w:hAnsi="Cambria Math"/>
+                            <w:i/>
+                          </w:rPr>
+                        </m:ctrlPr>
+                      </m:sSubPr>
+                      <m:e>
+                        <m:r>
+                          <w:rPr>
+                            <w:rFonts w:ascii="Cambria Math" w:hAnsi="Cambria Math"/>
+                          </w:rPr>
+                          <m:t>R</m:t>
+                        </m:r>
+                      </m:e>
+                      <m:sub>
+                        <m:r>
+                          <w:rPr>
+                            <w:rFonts w:ascii="Cambria Math" w:hAnsi="Cambria Math"/>
+                          </w:rPr>
+                          <m:t>t</m:t>
+                        </m:r>
+                      </m:sub>
+                    </m:sSub>
+                  </m:den>
+                </m:f>
+                <m:d>
+                  <m:dPr>
+                    <m:ctrlPr>
+                      <w:rPr>
+                        <w:rFonts w:ascii="Cambria Math" w:hAnsi="Cambria Math"/>
+                        <w:i/>
+                      </w:rPr>
+                    </m:ctrlPr>
+                  </m:dPr>
                   <m:e>
                     <m:f>
                       <m:fPr>
@@ -2438,64 +4343,24 @@
                         </m:ctrlPr>
                       </m:fPr>
                       <m:num>
-                        <m:sSub>
-                          <m:sSubPr>
-                            <m:ctrlPr>
-                              <w:rPr>
-                                <w:rFonts w:ascii="Cambria Math" w:hAnsi="Cambria Math"/>
-                                <w:i/>
-                              </w:rPr>
-                            </m:ctrlPr>
-                          </m:sSubPr>
-                          <m:e>
-                            <m:r>
-                              <w:rPr>
-                                <w:rFonts w:ascii="Cambria Math" w:hAnsi="Cambria Math"/>
-                              </w:rPr>
-                              <m:t>ρ</m:t>
-                            </m:r>
-                          </m:e>
-                          <m:sub>
-                            <m:r>
-                              <w:rPr>
-                                <w:rFonts w:ascii="Cambria Math" w:hAnsi="Cambria Math"/>
-                              </w:rPr>
-                              <m:t>t</m:t>
-                            </m:r>
-                          </m:sub>
-                        </m:sSub>
+                        <m:r>
+                          <w:rPr>
+                            <w:rFonts w:ascii="Cambria Math" w:hAnsi="Cambria Math"/>
+                          </w:rPr>
+                          <m:t>V+U</m:t>
+                        </m:r>
                       </m:num>
                       <m:den>
-                        <m:sSub>
-                          <m:sSubPr>
-                            <m:ctrlPr>
-                              <w:rPr>
-                                <w:rFonts w:ascii="Cambria Math" w:hAnsi="Cambria Math"/>
-                                <w:i/>
-                              </w:rPr>
-                            </m:ctrlPr>
-                          </m:sSubPr>
-                          <m:e>
-                            <m:r>
-                              <w:rPr>
-                                <w:rFonts w:ascii="Cambria Math" w:hAnsi="Cambria Math"/>
-                              </w:rPr>
-                              <m:t>ρ</m:t>
-                            </m:r>
-                          </m:e>
-                          <m:sub>
-                            <m:r>
-                              <w:rPr>
-                                <w:rFonts w:ascii="Cambria Math" w:hAnsi="Cambria Math"/>
-                              </w:rPr>
-                              <m:t>p</m:t>
-                            </m:r>
-                          </m:sub>
-                        </m:sSub>
+                        <m:r>
+                          <w:rPr>
+                            <w:rFonts w:ascii="Cambria Math" w:hAnsi="Cambria Math"/>
+                          </w:rPr>
+                          <m:t>V-U</m:t>
+                        </m:r>
                       </m:den>
                     </m:f>
                   </m:e>
-                </m:rad>
+                </m:d>
               </m:oMath>
             </m:oMathPara>
           </w:p>
@@ -2507,51 +4372,33 @@
           </w:tcPr>
           <w:p>
             <w:pPr>
+              <w:tabs>
+                <w:tab w:val="left" w:pos="864"/>
+              </w:tabs>
               <w:jc w:val="right"/>
             </w:pPr>
             <w:r>
-              <w:t>(3.7)</w:t>
+              <w:t>(3.</w:t>
+            </w:r>
+            <w:r>
+              <w:t>1</w:t>
+            </w:r>
+            <w:r>
+              <w:t>4</w:t>
+            </w:r>
+            <w:r>
+              <w:t>)</w:t>
             </w:r>
           </w:p>
         </w:tc>
       </w:tr>
     </w:tbl>
     <w:p>
-      <w:r>
-        <w:t>Gdzie:</w:t>
-      </w:r>
-    </w:p>
-    <w:p>
-      <w:r>
-        <w:tab/>
-      </w:r>
-      <w:proofErr w:type="spellStart"/>
-      <w:r>
-        <w:t>ρ</w:t>
-      </w:r>
-      <w:r>
-        <w:rPr>
-          <w:vertAlign w:val="subscript"/>
-        </w:rPr>
-        <w:t>t</w:t>
-      </w:r>
-      <w:proofErr w:type="spellEnd"/>
-      <w:r>
-        <w:t xml:space="preserve"> – gęstość materiału celu [kg/m</w:t>
-      </w:r>
-      <w:r>
-        <w:rPr>
-          <w:vertAlign w:val="superscript"/>
-        </w:rPr>
-        <w:t>3</w:t>
-      </w:r>
-      <w:r>
-        <w:t>]</w:t>
-      </w:r>
-    </w:p>
-    <w:p>
-      <w:r>
-        <w:t>Penetrację P pocisku można opisać wzorem:</w:t>
+      <w:pPr>
+        <w:keepNext w:val="0"/>
+      </w:pPr>
+      <w:r>
+        <w:t>Penetracja w tej wersji modelu zależy od prędkości wnikania, można zapisać ją jako:</w:t>
       </w:r>
     </w:p>
     <w:tbl>
@@ -2578,16 +4425,19 @@
           <w:tcPr>
             <w:tcW w:w="3209" w:type="dxa"/>
           </w:tcPr>
-          <w:p/>
+          <w:p>
+            <w:pPr>
+              <w:keepNext w:val="0"/>
+            </w:pPr>
+          </w:p>
         </w:tc>
         <w:tc>
           <w:tcPr>
             <w:tcW w:w="3209" w:type="dxa"/>
-            <w:vAlign w:val="center"/>
           </w:tcPr>
           <w:p>
             <w:pPr>
-              <w:jc w:val="center"/>
+              <w:keepNext w:val="0"/>
             </w:pPr>
             <m:oMathPara>
               <m:oMath>
@@ -2597,130 +4447,35 @@
                   </w:rPr>
                   <m:t>P=</m:t>
                 </m:r>
-                <m:f>
-                  <m:fPr>
+                <m:nary>
+                  <m:naryPr>
+                    <m:limLoc m:val="undOvr"/>
+                    <m:subHide m:val="1"/>
+                    <m:supHide m:val="1"/>
                     <m:ctrlPr>
                       <w:rPr>
                         <w:rFonts w:ascii="Cambria Math" w:hAnsi="Cambria Math"/>
                         <w:i/>
                       </w:rPr>
                     </m:ctrlPr>
-                  </m:fPr>
-                  <m:num>
-                    <m:sSub>
-                      <m:sSubPr>
-                        <m:ctrlPr>
-                          <w:rPr>
-                            <w:rFonts w:ascii="Cambria Math" w:hAnsi="Cambria Math"/>
-                            <w:i/>
-                          </w:rPr>
-                        </m:ctrlPr>
-                      </m:sSubPr>
-                      <m:e>
-                        <m:r>
-                          <w:rPr>
-                            <w:rFonts w:ascii="Cambria Math" w:hAnsi="Cambria Math"/>
-                          </w:rPr>
-                          <m:t>ρ</m:t>
-                        </m:r>
-                      </m:e>
-                      <m:sub>
-                        <m:r>
-                          <w:rPr>
-                            <w:rFonts w:ascii="Cambria Math" w:hAnsi="Cambria Math"/>
-                          </w:rPr>
-                          <m:t>p</m:t>
-                        </m:r>
-                      </m:sub>
-                    </m:sSub>
-                    <m:sSub>
-                      <m:sSubPr>
-                        <m:ctrlPr>
-                          <w:rPr>
-                            <w:rFonts w:ascii="Cambria Math" w:hAnsi="Cambria Math"/>
-                            <w:i/>
-                          </w:rPr>
-                        </m:ctrlPr>
-                      </m:sSubPr>
-                      <m:e>
-                        <m:r>
-                          <w:rPr>
-                            <w:rFonts w:ascii="Cambria Math" w:hAnsi="Cambria Math"/>
-                          </w:rPr>
-                          <m:t>L</m:t>
-                        </m:r>
-                      </m:e>
-                      <m:sub>
-                        <m:r>
-                          <w:rPr>
-                            <w:rFonts w:ascii="Cambria Math" w:hAnsi="Cambria Math"/>
-                          </w:rPr>
-                          <m:t>eff</m:t>
-                        </m:r>
-                      </m:sub>
-                    </m:sSub>
-                    <m:sSup>
-                      <m:sSupPr>
-                        <m:ctrlPr>
-                          <w:rPr>
-                            <w:rFonts w:ascii="Cambria Math" w:hAnsi="Cambria Math"/>
-                            <w:i/>
-                          </w:rPr>
-                        </m:ctrlPr>
-                      </m:sSupPr>
-                      <m:e>
-                        <m:r>
-                          <w:rPr>
-                            <w:rFonts w:ascii="Cambria Math" w:hAnsi="Cambria Math"/>
-                          </w:rPr>
-                          <m:t>V</m:t>
-                        </m:r>
-                      </m:e>
-                      <m:sup>
-                        <m:r>
-                          <w:rPr>
-                            <w:rFonts w:ascii="Cambria Math" w:hAnsi="Cambria Math"/>
-                          </w:rPr>
-                          <m:t>2</m:t>
-                        </m:r>
-                      </m:sup>
-                    </m:sSup>
-                  </m:num>
-                  <m:den>
+                  </m:naryPr>
+                  <m:sub/>
+                  <m:sup/>
+                  <m:e>
                     <m:r>
                       <w:rPr>
                         <w:rFonts w:ascii="Cambria Math" w:hAnsi="Cambria Math"/>
                       </w:rPr>
-                      <m:t>2</m:t>
+                      <m:t>U(t)</m:t>
                     </m:r>
-                    <m:sSub>
-                      <m:sSubPr>
-                        <m:ctrlPr>
-                          <w:rPr>
-                            <w:rFonts w:ascii="Cambria Math" w:hAnsi="Cambria Math"/>
-                            <w:i/>
-                          </w:rPr>
-                        </m:ctrlPr>
-                      </m:sSubPr>
-                      <m:e>
-                        <m:r>
-                          <w:rPr>
-                            <w:rFonts w:ascii="Cambria Math" w:hAnsi="Cambria Math"/>
-                          </w:rPr>
-                          <m:t>R</m:t>
-                        </m:r>
-                      </m:e>
-                      <m:sub>
-                        <m:r>
-                          <w:rPr>
-                            <w:rFonts w:ascii="Cambria Math" w:hAnsi="Cambria Math"/>
-                          </w:rPr>
-                          <m:t>t</m:t>
-                        </m:r>
-                      </m:sub>
-                    </m:sSub>
-                  </m:den>
-                </m:f>
+                  </m:e>
+                </m:nary>
+                <m:r>
+                  <w:rPr>
+                    <w:rFonts w:ascii="Cambria Math" w:hAnsi="Cambria Math"/>
+                  </w:rPr>
+                  <m:t>dt</m:t>
+                </m:r>
               </m:oMath>
             </m:oMathPara>
           </w:p>
@@ -2732,21 +4487,40 @@
           </w:tcPr>
           <w:p>
             <w:pPr>
+              <w:keepNext w:val="0"/>
               <w:jc w:val="right"/>
             </w:pPr>
             <w:r>
-              <w:t>3.8</w:t>
+              <w:t>(3.1</w:t>
+            </w:r>
+            <w:r>
+              <w:t>5</w:t>
+            </w:r>
+            <w:r>
+              <w:t>)</w:t>
             </w:r>
           </w:p>
         </w:tc>
       </w:tr>
     </w:tbl>
     <w:p>
-      <w:r>
-        <w:t>Gdzie</w:t>
-      </w:r>
-      <w:r>
-        <w:t xml:space="preserve"> długość efektywna to:</w:t>
+      <w:pPr>
+        <w:keepNext w:val="0"/>
+      </w:pPr>
+      <w:r>
+        <w:t xml:space="preserve">W celu wyznaczenia penetracji należy scałkować prędkość wnikania po czasie, aby to zrobić należy uzależnić U od czasu (t). </w:t>
+      </w:r>
+      <w:r>
+        <w:t>Jest to zrobione pośrednio w równaniu 3.</w:t>
+      </w:r>
+      <w:r>
+        <w:t>12</w:t>
+      </w:r>
+      <w:r>
+        <w:t xml:space="preserve">, uzależniono w nim U od prędkości pocisku V. Pocisk podczas wnikania jest cały czas hamowany, przez co zmienia się jego prędkość, można wyliczyć </w:t>
+      </w:r>
+      <w:r>
+        <w:t>ujemne przyśpieszenie pocisku ze wzoru:</w:t>
       </w:r>
     </w:p>
     <w:tbl>
@@ -2773,50 +4547,27 @@
           <w:tcPr>
             <w:tcW w:w="3209" w:type="dxa"/>
           </w:tcPr>
-          <w:p/>
+          <w:p>
+            <w:pPr>
+              <w:keepNext w:val="0"/>
+            </w:pPr>
+          </w:p>
         </w:tc>
         <w:tc>
           <w:tcPr>
             <w:tcW w:w="3209" w:type="dxa"/>
-            <w:vAlign w:val="center"/>
           </w:tcPr>
           <w:p>
             <w:pPr>
-              <w:jc w:val="center"/>
+              <w:keepNext w:val="0"/>
             </w:pPr>
             <m:oMathPara>
               <m:oMath>
-                <m:sSub>
-                  <m:sSubPr>
-                    <m:ctrlPr>
-                      <w:rPr>
-                        <w:rFonts w:ascii="Cambria Math" w:hAnsi="Cambria Math"/>
-                        <w:i/>
-                      </w:rPr>
-                    </m:ctrlPr>
-                  </m:sSubPr>
-                  <m:e>
-                    <m:r>
-                      <w:rPr>
-                        <w:rFonts w:ascii="Cambria Math" w:hAnsi="Cambria Math"/>
-                      </w:rPr>
-                      <m:t>L</m:t>
-                    </m:r>
-                  </m:e>
-                  <m:sub>
-                    <m:r>
-                      <w:rPr>
-                        <w:rFonts w:ascii="Cambria Math" w:hAnsi="Cambria Math"/>
-                      </w:rPr>
-                      <m:t>eff</m:t>
-                    </m:r>
-                  </m:sub>
-                </m:sSub>
                 <m:r>
                   <w:rPr>
                     <w:rFonts w:ascii="Cambria Math" w:hAnsi="Cambria Math"/>
                   </w:rPr>
-                  <m:t>=</m:t>
+                  <m:t>a=</m:t>
                 </m:r>
                 <m:f>
                   <m:fPr>
@@ -2832,7 +4583,7 @@
                       <w:rPr>
                         <w:rFonts w:ascii="Cambria Math" w:hAnsi="Cambria Math"/>
                       </w:rPr>
-                      <m:t>m</m:t>
+                      <m:t>dV</m:t>
                     </m:r>
                   </m:num>
                   <m:den>
@@ -2840,34 +4591,54 @@
                       <w:rPr>
                         <w:rFonts w:ascii="Cambria Math" w:hAnsi="Cambria Math"/>
                       </w:rPr>
-                      <m:t>π</m:t>
+                      <m:t>dt</m:t>
                     </m:r>
-                    <m:sSup>
-                      <m:sSupPr>
+                  </m:den>
+                </m:f>
+                <m:r>
+                  <w:rPr>
+                    <w:rFonts w:ascii="Cambria Math" w:hAnsi="Cambria Math"/>
+                  </w:rPr>
+                  <m:t>=-</m:t>
+                </m:r>
+                <m:f>
+                  <m:fPr>
+                    <m:ctrlPr>
+                      <w:rPr>
+                        <w:rFonts w:ascii="Cambria Math" w:hAnsi="Cambria Math"/>
+                        <w:i/>
+                      </w:rPr>
+                    </m:ctrlPr>
+                  </m:fPr>
+                  <m:num>
+                    <m:sSub>
+                      <m:sSubPr>
                         <m:ctrlPr>
                           <w:rPr>
                             <w:rFonts w:ascii="Cambria Math" w:hAnsi="Cambria Math"/>
                             <w:i/>
                           </w:rPr>
                         </m:ctrlPr>
-                      </m:sSupPr>
+                      </m:sSubPr>
                       <m:e>
                         <m:r>
                           <w:rPr>
                             <w:rFonts w:ascii="Cambria Math" w:hAnsi="Cambria Math"/>
                           </w:rPr>
-                          <m:t>r</m:t>
+                          <m:t>Y</m:t>
                         </m:r>
                       </m:e>
-                      <m:sup>
+                      <m:sub>
                         <m:r>
                           <w:rPr>
                             <w:rFonts w:ascii="Cambria Math" w:hAnsi="Cambria Math"/>
                           </w:rPr>
-                          <m:t>2</m:t>
+                          <m:t>p</m:t>
                         </m:r>
-                      </m:sup>
-                    </m:sSup>
+                      </m:sub>
+                    </m:sSub>
+                  </m:num>
+                  <m:den>
                     <m:sSub>
                       <m:sSubPr>
                         <m:ctrlPr>
@@ -2894,6 +4665,12 @@
                         </m:r>
                       </m:sub>
                     </m:sSub>
+                    <m:r>
+                      <w:rPr>
+                        <w:rFonts w:ascii="Cambria Math" w:hAnsi="Cambria Math"/>
+                      </w:rPr>
+                      <m:t>L</m:t>
+                    </m:r>
                   </m:den>
                 </m:f>
               </m:oMath>
@@ -2907,30 +4684,204 @@
           </w:tcPr>
           <w:p>
             <w:pPr>
+              <w:keepNext w:val="0"/>
               <w:jc w:val="right"/>
             </w:pPr>
             <w:r>
-              <w:t>3.9</w:t>
+              <w:t>(3.16)</w:t>
             </w:r>
           </w:p>
         </w:tc>
       </w:tr>
     </w:tbl>
     <w:p>
-      <w:r>
-        <w:t>Gdzie:</w:t>
-      </w:r>
-    </w:p>
-    <w:p>
-      <w:r>
-        <w:tab/>
-        <w:t>m – masa pocisku [kg]</w:t>
-      </w:r>
-    </w:p>
-    <w:p>
-      <w:r>
-        <w:tab/>
-        <w:t>r – promień pocisku (połowa kalibru) [m]</w:t>
+      <w:pPr>
+        <w:keepNext w:val="0"/>
+      </w:pPr>
+      <w:r>
+        <w:t>Gdzie L to</w:t>
+      </w:r>
+      <w:r>
+        <w:t xml:space="preserve"> chwilowa</w:t>
+      </w:r>
+      <w:r>
+        <w:t xml:space="preserve"> długość pocisku [m]</w:t>
+      </w:r>
+    </w:p>
+    <w:p>
+      <w:pPr>
+        <w:keepNext w:val="0"/>
+      </w:pPr>
+      <w:r>
+        <w:t>Podczas erozji pocisku</w:t>
+      </w:r>
+      <w:r>
+        <w:t xml:space="preserve"> jego długość ulega zmianie, można opisać</w:t>
+      </w:r>
+      <w:r>
+        <w:t xml:space="preserve"> ją</w:t>
+      </w:r>
+      <w:r>
+        <w:t xml:space="preserve"> jako:</w:t>
+      </w:r>
+    </w:p>
+    <w:tbl>
+      <w:tblPr>
+        <w:tblStyle w:val="TableGrid"/>
+        <w:tblW w:w="0" w:type="auto"/>
+        <w:tblBorders>
+          <w:top w:val="none" w:sz="0" w:space="0" w:color="auto"/>
+          <w:left w:val="none" w:sz="0" w:space="0" w:color="auto"/>
+          <w:bottom w:val="none" w:sz="0" w:space="0" w:color="auto"/>
+          <w:right w:val="none" w:sz="0" w:space="0" w:color="auto"/>
+          <w:insideH w:val="none" w:sz="0" w:space="0" w:color="auto"/>
+          <w:insideV w:val="none" w:sz="0" w:space="0" w:color="auto"/>
+        </w:tblBorders>
+        <w:tblLook w:val="04A0" w:firstRow="1" w:lastRow="0" w:firstColumn="1" w:lastColumn="0" w:noHBand="0" w:noVBand="1"/>
+      </w:tblPr>
+      <w:tblGrid>
+        <w:gridCol w:w="3209"/>
+        <w:gridCol w:w="3209"/>
+        <w:gridCol w:w="3210"/>
+      </w:tblGrid>
+      <w:tr>
+        <w:tc>
+          <w:tcPr>
+            <w:tcW w:w="3209" w:type="dxa"/>
+          </w:tcPr>
+          <w:p>
+            <w:pPr>
+              <w:keepNext w:val="0"/>
+            </w:pPr>
+          </w:p>
+        </w:tc>
+        <w:tc>
+          <w:tcPr>
+            <w:tcW w:w="3209" w:type="dxa"/>
+          </w:tcPr>
+          <w:p>
+            <w:pPr>
+              <w:keepNext w:val="0"/>
+            </w:pPr>
+            <m:oMathPara>
+              <m:oMath>
+                <m:f>
+                  <m:fPr>
+                    <m:ctrlPr>
+                      <w:rPr>
+                        <w:rFonts w:ascii="Cambria Math" w:hAnsi="Cambria Math"/>
+                        <w:i/>
+                      </w:rPr>
+                    </m:ctrlPr>
+                  </m:fPr>
+                  <m:num>
+                    <m:r>
+                      <w:rPr>
+                        <w:rFonts w:ascii="Cambria Math" w:hAnsi="Cambria Math"/>
+                      </w:rPr>
+                      <m:t>dL</m:t>
+                    </m:r>
+                  </m:num>
+                  <m:den>
+                    <m:r>
+                      <w:rPr>
+                        <w:rFonts w:ascii="Cambria Math" w:hAnsi="Cambria Math"/>
+                      </w:rPr>
+                      <m:t>dt</m:t>
+                    </m:r>
+                  </m:den>
+                </m:f>
+                <m:r>
+                  <w:rPr>
+                    <w:rFonts w:ascii="Cambria Math" w:hAnsi="Cambria Math"/>
+                  </w:rPr>
+                  <m:t>=-(V-U)</m:t>
+                </m:r>
+              </m:oMath>
+            </m:oMathPara>
+          </w:p>
+        </w:tc>
+        <w:tc>
+          <w:tcPr>
+            <w:tcW w:w="3210" w:type="dxa"/>
+            <w:vAlign w:val="center"/>
+          </w:tcPr>
+          <w:p>
+            <w:pPr>
+              <w:keepNext w:val="0"/>
+              <w:jc w:val="right"/>
+            </w:pPr>
+            <w:r>
+              <w:t>(3.17)</w:t>
+            </w:r>
+          </w:p>
+        </w:tc>
+      </w:tr>
+    </w:tbl>
+    <w:p>
+      <w:pPr>
+        <w:keepNext w:val="0"/>
+      </w:pPr>
+      <w:r>
+        <w:t>Dzięki równaniom 3.1</w:t>
+      </w:r>
+      <w:r>
+        <w:t>2</w:t>
+      </w:r>
+      <w:r>
+        <w:t>, 3.1</w:t>
+      </w:r>
+      <w:r>
+        <w:t>6</w:t>
+      </w:r>
+      <w:r>
+        <w:t xml:space="preserve"> i 3.1</w:t>
+      </w:r>
+      <w:r>
+        <w:t>7</w:t>
+      </w:r>
+      <w:r>
+        <w:t xml:space="preserve"> można numerycznie obliczyć penetrację (3.13), oraz pośrednio </w:t>
+      </w:r>
+      <w:r>
+        <w:t xml:space="preserve">odpowiednio ustalając warunki brzegowe (V &gt; </w:t>
+      </w:r>
+      <w:proofErr w:type="spellStart"/>
+      <w:r>
+        <w:t>V</w:t>
+      </w:r>
+      <w:r>
+        <w:rPr>
+          <w:vertAlign w:val="subscript"/>
+        </w:rPr>
+        <w:t>c</w:t>
+      </w:r>
+      <w:proofErr w:type="spellEnd"/>
+      <w:r>
+        <w:t>,</w:t>
+      </w:r>
+      <w:r>
+        <w:t xml:space="preserve"> </w:t>
+      </w:r>
+      <w:r>
+        <w:t xml:space="preserve">P &lt; H) </w:t>
+      </w:r>
+      <w:r>
+        <w:t xml:space="preserve">po zakończeniu obliczeń otrzymujemy prędkość wyjścia </w:t>
+      </w:r>
+      <w:proofErr w:type="spellStart"/>
+      <w:r>
+        <w:t>V</w:t>
+      </w:r>
+      <w:r>
+        <w:rPr>
+          <w:vertAlign w:val="subscript"/>
+        </w:rPr>
+        <w:t>r</w:t>
+      </w:r>
+      <w:proofErr w:type="spellEnd"/>
+      <w:r>
+        <w:t>.</w:t>
       </w:r>
     </w:p>
     <w:p>
@@ -2972,6 +4923,13 @@
         </w:rPr>
         <w:t>] Rosenberg Z., Dekel E., Terminal Ballistics, Springer-Verlag Berlin Heidelberg, 2012.</w:t>
       </w:r>
+    </w:p>
+    <w:p>
+      <w:pPr>
+        <w:rPr>
+          <w:lang w:val="en-GB"/>
+        </w:rPr>
+      </w:pPr>
     </w:p>
     <w:sectPr>
       <w:headerReference w:type="even" r:id="rId9"/>
@@ -3556,7 +5514,7 @@
   <w:abstractNum w:abstractNumId="4" w15:restartNumberingAfterBreak="0">
     <w:nsid w:val="6AE777F4"/>
     <w:multiLevelType w:val="multilevel"/>
-    <w:tmpl w:val="66E24C80"/>
+    <w:tmpl w:val="626AF97A"/>
     <w:lvl w:ilvl="0">
       <w:start w:val="1"/>
       <w:numFmt w:val="decimal"/>
@@ -3577,7 +5535,7 @@
       <w:lvlText w:val="%1.%2"/>
       <w:lvlJc w:val="left"/>
       <w:pPr>
-        <w:ind w:left="720" w:hanging="363"/>
+        <w:ind w:left="357" w:hanging="357"/>
       </w:pPr>
       <w:rPr>
         <w:rFonts w:hint="default"/>
@@ -3590,7 +5548,7 @@
       <w:lvlText w:val="%1.%2.%3"/>
       <w:lvlJc w:val="left"/>
       <w:pPr>
-        <w:ind w:left="1077" w:hanging="357"/>
+        <w:ind w:left="357" w:hanging="357"/>
       </w:pPr>
       <w:rPr>
         <w:rFonts w:hint="default"/>
@@ -4171,7 +6129,7 @@
   <w:style w:type="paragraph" w:default="1" w:styleId="Normal">
     <w:name w:val="Normal"/>
     <w:qFormat/>
-    <w:rsid w:val="00EB47D4"/>
+    <w:rsid w:val="008C30AD"/>
     <w:pPr>
       <w:keepNext/>
       <w:spacing w:line="360" w:lineRule="auto"/>
@@ -4259,7 +6217,6 @@
   <w:style w:type="character" w:default="1" w:styleId="DefaultParagraphFont">
     <w:name w:val="Default Paragraph Font"/>
     <w:uiPriority w:val="1"/>
-    <w:semiHidden/>
     <w:unhideWhenUsed/>
   </w:style>
   <w:style w:type="table" w:default="1" w:styleId="TableNormal">
@@ -4596,6 +6553,45 @@
       <w:lang w:eastAsia="en-US"/>
     </w:rPr>
   </w:style>
+  <w:style w:type="paragraph" w:styleId="EndnoteText">
+    <w:name w:val="endnote text"/>
+    <w:basedOn w:val="Normal"/>
+    <w:link w:val="EndnoteTextChar"/>
+    <w:uiPriority w:val="99"/>
+    <w:semiHidden/>
+    <w:unhideWhenUsed/>
+    <w:rsid w:val="00A61FCA"/>
+    <w:pPr>
+      <w:spacing w:line="240" w:lineRule="auto"/>
+    </w:pPr>
+    <w:rPr>
+      <w:sz w:val="20"/>
+      <w:szCs w:val="20"/>
+    </w:rPr>
+  </w:style>
+  <w:style w:type="character" w:customStyle="1" w:styleId="EndnoteTextChar">
+    <w:name w:val="Endnote Text Char"/>
+    <w:basedOn w:val="DefaultParagraphFont"/>
+    <w:link w:val="EndnoteText"/>
+    <w:uiPriority w:val="99"/>
+    <w:semiHidden/>
+    <w:rsid w:val="00A61FCA"/>
+    <w:rPr>
+      <w:rFonts w:ascii="Times New Roman" w:eastAsia="Times New Roman" w:hAnsi="Times New Roman"/>
+      <w:lang w:eastAsia="en-US"/>
+    </w:rPr>
+  </w:style>
+  <w:style w:type="character" w:styleId="EndnoteReference">
+    <w:name w:val="endnote reference"/>
+    <w:basedOn w:val="DefaultParagraphFont"/>
+    <w:uiPriority w:val="99"/>
+    <w:semiHidden/>
+    <w:unhideWhenUsed/>
+    <w:rsid w:val="00A61FCA"/>
+    <w:rPr>
+      <w:vertAlign w:val="superscript"/>
+    </w:rPr>
+  </w:style>
 </w:styles>
 </file>
 

</xml_diff>